<commit_message>
Record no-battery rule and unpowered-pedal behavior in spec
Pedals always run from a power cable, so no MIDI pass-through relay is
added. The spec now explains what happens if a pedal loses power, and
the related open questions are removed from the spec and Flashover doc.

Co-Authored-By: Claude Opus 5.5 <noreply@anthropic.com>
</commit_message>
<xml_diff>
--- a/Linework Control Specification.docx
+++ b/Linework Control Specification.docx
@@ -361,6 +361,24 @@
     </w:p>
     <w:p>
       <w:pPr>
+        <w:pStyle w:val="ListParagraph"/>
+        <w:numPr>
+          <w:ilvl w:val="0"/>
+          <w:numId w:val="90"/>
+        </w:numPr>
+      </w:pPr>
+      <w:r>
+        <w:rPr>
+          <w:b/>
+        </w:rPr>
+        <w:t xml:space="preserve">No batteries.</w:t>
+      </w:r>
+      <w:r>
+        <w:t xml:space="preserve"> Every pedal runs from a power supply cable; there is no battery compartment.</w:t>
+      </w:r>
+    </w:p>
+    <w:p>
+      <w:pPr>
         <w:pStyle w:val="Heading1"/>
       </w:pPr>
       <w:r>
@@ -517,6 +535,73 @@
       </w:pPr>
       <w:r>
         <w:t xml:space="preserve">MIDI cables carry control messages only, never audio or power.</w:t>
+      </w:r>
+    </w:p>
+    <w:p>
+      <w:pPr>
+        <w:pStyle w:val="Heading2"/>
+      </w:pPr>
+      <w:r>
+        <w:t xml:space="preserve">If a pedal loses power</w:t>
+      </w:r>
+    </w:p>
+    <w:p>
+      <w:r>
+        <w:t xml:space="preserve">A pedal with no power stops passing messages on. Because pedals have no batteries, this only happens if a power cable is knocked out or a supply fails, so no extra hardware is added for it. Instead:</w:t>
+      </w:r>
+    </w:p>
+    <w:p>
+      <w:pPr>
+        <w:pStyle w:val="ListParagraph"/>
+        <w:numPr>
+          <w:ilvl w:val="0"/>
+          <w:numId w:val="90"/>
+        </w:numPr>
+      </w:pPr>
+      <w:r>
+        <w:rPr>
+          <w:b/>
+        </w:rPr>
+        <w:t xml:space="preserve">The sound keeps working.</w:t>
+      </w:r>
+      <w:r>
+        <w:t xml:space="preserve"> The unpowered pedal’s bypass relay passes the guitar signal straight through, so only that one effect drops out.</w:t>
+      </w:r>
+    </w:p>
+    <w:p>
+      <w:pPr>
+        <w:pStyle w:val="ListParagraph"/>
+        <w:numPr>
+          <w:ilvl w:val="0"/>
+          <w:numId w:val="90"/>
+        </w:numPr>
+      </w:pPr>
+      <w:r>
+        <w:rPr>
+          <w:b/>
+        </w:rPr>
+        <w:t xml:space="preserve">Pedals before the break</w:t>
+      </w:r>
+      <w:r>
+        <w:t xml:space="preserve"> still receive Switchyard’s messages; only the pedals after it lose contact.</w:t>
+      </w:r>
+    </w:p>
+    <w:p>
+      <w:pPr>
+        <w:pStyle w:val="ListParagraph"/>
+        <w:numPr>
+          <w:ilvl w:val="0"/>
+          <w:numId w:val="90"/>
+        </w:numPr>
+      </w:pPr>
+      <w:r>
+        <w:rPr>
+          <w:b/>
+        </w:rPr>
+        <w:t xml:space="preserve">Switchyard detects the break</w:t>
+      </w:r>
+      <w:r>
+        <w:t xml:space="preserve"> because its messages stop coming back around the loop, and the app shows which pedal to check.</w:t>
       </w:r>
     </w:p>
     <w:p>
@@ -1686,24 +1771,6 @@
       </w:pPr>
       <w:r>
         <w:t xml:space="preserve">Open questions</w:t>
-      </w:r>
-    </w:p>
-    <w:p>
-      <w:pPr>
-        <w:pStyle w:val="ListParagraph"/>
-        <w:numPr>
-          <w:ilvl w:val="0"/>
-          <w:numId w:val="90"/>
-        </w:numPr>
-      </w:pPr>
-      <w:r>
-        <w:rPr>
-          <w:b/>
-        </w:rPr>
-        <w:t xml:space="preserve">Unpowered pedals:</w:t>
-      </w:r>
-      <w:r>
-        <w:t xml:space="preserve"> if a pedal in the loop has no power, it stops passing messages on and every pedal after it loses contact. Options are to let the app show where the loop is broken, or add a small relay in each pedal that connects MIDI in straight to MIDI out when unpowered (about $1).</w:t>
       </w:r>
     </w:p>
     <w:p>

</xml_diff>

<commit_message>
Add the SysEx byte layouts to the Linework Control Specification
Copies the frame, message table, acknowledgement codes and firmware
packing from the Flashover MIDI reference, written for any Linework
pedal (model number from each product document, settings as CC pairs).
Ticks the matching open decision in the MIDI reference.

Co-Authored-By: Claude Opus 5.5 <noreply@anthropic.com>
</commit_message>
<xml_diff>
--- a/Linework Control Specification.docx
+++ b/Linework Control Specification.docx
@@ -1074,7 +1074,7 @@
     </w:p>
     <w:p>
       <w:r>
-        <w:t xml:space="preserve">Messages that aren’t about a pedal’s sound use MIDI “system exclusive” messages, which carry our own manufacturer ID. Proposed messages:</w:t>
+        <w:t xml:space="preserve">Messages that aren’t about a pedal’s sound use MIDI “system exclusive” messages, which carry our own manufacturer ID. The messages:</w:t>
       </w:r>
     </w:p>
     <w:tbl>
@@ -1469,19 +1469,1134 @@
     </w:tbl>
     <w:p/>
     <w:p>
-      <w:r>
-        <w:t xml:space="preserve">The detailed byte layout of each message will be written once the first prototype is working.</w:t>
-      </w:r>
-    </w:p>
-    <w:p>
+      <w:pPr>
+        <w:pStyle w:val="Heading3"/>
+      </w:pPr>
+      <w:r>
+        <w:t xml:space="preserve">Byte layouts</w:t>
+      </w:r>
+    </w:p>
+    <w:p>
+      <w:pPr/>
+      <w:r>
+        <w:t xml:space="preserve">Bytes are written in hex. Every Linework system message has the same frame: </w:t>
+      </w:r>
+      <w:r>
+        <w:rPr>
+          <w:rFonts w:ascii="Consolas" w:hAnsi="Consolas"/>
+        </w:rPr>
+        <w:t xml:space="preserve">F0 7D 4C 57 cc qq … F7</w:t>
+      </w:r>
+    </w:p>
+    <w:p>
+      <w:pPr>
+        <w:pStyle w:val="ListParagraph"/>
+        <w:numPr>
+          <w:ilvl w:val="0"/>
+          <w:numId w:val="90"/>
+        </w:numPr>
+      </w:pPr>
+      <w:r>
+        <w:rPr>
+          <w:rFonts w:ascii="Consolas" w:hAnsi="Consolas"/>
+        </w:rPr>
+        <w:t xml:space="preserve">7D</w:t>
+      </w:r>
+      <w:r>
+        <w:t xml:space="preserve"> is the temporary manufacturer ID (see below). </w:t>
+      </w:r>
+      <w:r>
+        <w:rPr>
+          <w:rFonts w:ascii="Consolas" w:hAnsi="Consolas"/>
+        </w:rPr>
+        <w:t xml:space="preserve">4C 57</w:t>
+      </w:r>
+      <w:r>
+        <w:t xml:space="preserve"> (“LW”) marks the message as Linework, since other gear may also use </w:t>
+      </w:r>
+      <w:r>
+        <w:rPr>
+          <w:rFonts w:ascii="Consolas" w:hAnsi="Consolas"/>
+        </w:rPr>
+        <w:t xml:space="preserve">7D</w:t>
+      </w:r>
+      <w:r>
+        <w:t xml:space="preserve">.</w:t>
+      </w:r>
+    </w:p>
+    <w:p>
+      <w:pPr>
+        <w:pStyle w:val="ListParagraph"/>
+        <w:numPr>
+          <w:ilvl w:val="0"/>
+          <w:numId w:val="90"/>
+        </w:numPr>
+      </w:pPr>
+      <w:r>
+        <w:rPr>
+          <w:rFonts w:ascii="Consolas" w:hAnsi="Consolas"/>
+        </w:rPr>
+        <w:t xml:space="preserve">cc</w:t>
+      </w:r>
+      <w:r>
+        <w:t xml:space="preserve"> is the command; </w:t>
+      </w:r>
+      <w:r>
+        <w:rPr>
+          <w:rFonts w:ascii="Consolas" w:hAnsi="Consolas"/>
+        </w:rPr>
+        <w:t xml:space="preserve">ch</w:t>
+      </w:r>
+      <w:r>
+        <w:t xml:space="preserve"> is a channel, 00–0F.</w:t>
+      </w:r>
+    </w:p>
+    <w:p>
+      <w:pPr>
+        <w:pStyle w:val="ListParagraph"/>
+        <w:numPr>
+          <w:ilvl w:val="0"/>
+          <w:numId w:val="90"/>
+        </w:numPr>
+      </w:pPr>
+      <w:r>
+        <w:rPr>
+          <w:rFonts w:ascii="Consolas" w:hAnsi="Consolas"/>
+        </w:rPr>
+        <w:t xml:space="preserve">qq</w:t>
+      </w:r>
+      <w:r>
+        <w:t xml:space="preserve"> is a sequence number, 00–7F. Switchyard counts it up with each request, going from 7F back to 00, and every answer repeats it. That way a lost or late answer is never matched to the wrong request. Pedal info answers the standard identity request, which has no </w:t>
+      </w:r>
+      <w:r>
+        <w:rPr>
+          <w:rFonts w:ascii="Consolas" w:hAnsi="Consolas"/>
+        </w:rPr>
+        <w:t xml:space="preserve">qq</w:t>
+      </w:r>
+      <w:r>
+        <w:t xml:space="preserve">, so it sends 00.</w:t>
+      </w:r>
+    </w:p>
+    <w:p>
+      <w:pPr>
+        <w:pStyle w:val="ListParagraph"/>
+        <w:numPr>
+          <w:ilvl w:val="0"/>
+          <w:numId w:val="90"/>
+        </w:numPr>
+      </w:pPr>
       <w:r>
         <w:rPr>
           <w:b/>
         </w:rPr>
+        <w:t xml:space="preserve">Serial</w:t>
+      </w:r>
+      <w:r>
+        <w:t xml:space="preserve"> </w:t>
+      </w:r>
+      <w:r>
+        <w:rPr>
+          <w:rFonts w:ascii="Consolas" w:hAnsi="Consolas"/>
+        </w:rPr>
+        <w:t xml:space="preserve">s0…s9</w:t>
+      </w:r>
+      <w:r>
+        <w:t xml:space="preserve">: the pedal’s 64-bit unique ID, split into ten 7-bit bytes.</w:t>
+      </w:r>
+    </w:p>
+    <w:p>
+      <w:pPr>
+        <w:pStyle w:val="ListParagraph"/>
+        <w:numPr>
+          <w:ilvl w:val="0"/>
+          <w:numId w:val="90"/>
+        </w:numPr>
+      </w:pPr>
+      <w:r>
+        <w:rPr>
+          <w:b/>
+        </w:rPr>
+        <w:t xml:space="preserve">Settings</w:t>
+      </w:r>
+      <w:r>
+        <w:t xml:space="preserve"> </w:t>
+      </w:r>
+      <w:r>
+        <w:rPr>
+          <w:rFonts w:ascii="Consolas" w:hAnsi="Consolas"/>
+        </w:rPr>
+        <w:t xml:space="preserve">(pairs)</w:t>
+      </w:r>
+      <w:r>
+        <w:t xml:space="preserve">: a control change number then its value, one pair per control, using the same values as the matching control change. A pedal sends its own control change numbers, so Switchyard can read any Linework pedal without knowing its model. The </w:t>
+      </w:r>
+      <w:r>
+        <w:rPr>
+          <w:rFonts w:ascii="Consolas" w:hAnsi="Consolas"/>
+        </w:rPr>
+        <w:t xml:space="preserve">F7</w:t>
+      </w:r>
+      <w:r>
+        <w:t xml:space="preserve"> marks where the pairs end. Flashover, for example, sends </w:t>
+      </w:r>
+      <w:r>
+        <w:rPr>
+          <w:rFonts w:ascii="Consolas" w:hAnsi="Consolas"/>
+        </w:rPr>
+        <w:t xml:space="preserve">14 gg 15 tt 16 ll 51 mm 50 oo</w:t>
+      </w:r>
+      <w:r>
+        <w:t xml:space="preserve">: Gain, Tone, Level, clipping mode and on/off.</w:t>
+      </w:r>
+    </w:p>
+    <w:tbl>
+      <w:tblPr>
+        <w:tblW w:w="9360" w:type="dxa"/>
+        <w:tblBorders>
+          <w:top w:val="single" w:sz="4" w:space="0" w:color="A0A0A0"/>
+          <w:left w:val="single" w:sz="4" w:space="0" w:color="A0A0A0"/>
+          <w:bottom w:val="single" w:sz="4" w:space="0" w:color="A0A0A0"/>
+          <w:right w:val="single" w:sz="4" w:space="0" w:color="A0A0A0"/>
+          <w:insideH w:val="single" w:sz="4" w:space="0" w:color="A0A0A0"/>
+          <w:insideV w:val="single" w:sz="4" w:space="0" w:color="A0A0A0"/>
+        </w:tblBorders>
+        <w:tblLayout w:type="fixed"/>
+        <w:tblCellMar>
+          <w:top w:w="40" w:type="dxa"/>
+          <w:left w:w="100" w:type="dxa"/>
+          <w:bottom w:w="40" w:type="dxa"/>
+          <w:right w:w="100" w:type="dxa"/>
+        </w:tblCellMar>
+      </w:tblPr>
+      <w:tblGrid>
+        <w:gridCol w:w="2000"/>
+        <w:gridCol w:w="3900"/>
+        <w:gridCol w:w="3460"/>
+      </w:tblGrid>
+      <w:tr>
+        <w:trPr>
+          <w:cantSplit/>
+          <w:tblHeader/>
+        </w:trPr>
+        <w:tc>
+          <w:tcPr>
+            <w:tcW w:w="2000" w:type="dxa"/>
+            <w:shd w:val="clear" w:color="auto" w:fill="E7E6E6"/>
+          </w:tcPr>
+          <w:p>
+            <w:pPr>
+              <w:spacing w:before="0" w:after="0"/>
+            </w:pPr>
+            <w:r>
+              <w:rPr>
+                <w:b/>
+              </w:rPr>
+              <w:t xml:space="preserve">Message</w:t>
+            </w:r>
+          </w:p>
+        </w:tc>
+        <w:tc>
+          <w:tcPr>
+            <w:tcW w:w="3900" w:type="dxa"/>
+            <w:shd w:val="clear" w:color="auto" w:fill="E7E6E6"/>
+          </w:tcPr>
+          <w:p>
+            <w:pPr>
+              <w:spacing w:before="0" w:after="0"/>
+            </w:pPr>
+            <w:r>
+              <w:rPr>
+                <w:b/>
+              </w:rPr>
+              <w:t xml:space="preserve">Bytes Switchyard sends</w:t>
+            </w:r>
+          </w:p>
+        </w:tc>
+        <w:tc>
+          <w:tcPr>
+            <w:tcW w:w="3460" w:type="dxa"/>
+            <w:shd w:val="clear" w:color="auto" w:fill="E7E6E6"/>
+          </w:tcPr>
+          <w:p>
+            <w:pPr>
+              <w:spacing w:before="0" w:after="0"/>
+            </w:pPr>
+            <w:r>
+              <w:rPr>
+                <w:b/>
+              </w:rPr>
+              <w:t xml:space="preserve">Pedal’s answer</w:t>
+            </w:r>
+          </w:p>
+        </w:tc>
+      </w:tr>
+      <w:tr>
+        <w:trPr>
+          <w:cantSplit/>
+        </w:trPr>
+        <w:tc>
+          <w:tcPr>
+            <w:tcW w:w="2000" w:type="dxa"/>
+          </w:tcPr>
+          <w:p>
+            <w:pPr>
+              <w:spacing w:before="0" w:after="0"/>
+            </w:pPr>
+            <w:r>
+              <w:t xml:space="preserve">Position count</w:t>
+            </w:r>
+          </w:p>
+        </w:tc>
+        <w:tc>
+          <w:tcPr>
+            <w:tcW w:w="3900" w:type="dxa"/>
+          </w:tcPr>
+          <w:p>
+            <w:pPr>
+              <w:spacing w:before="0" w:after="0"/>
+            </w:pPr>
+            <w:r>
+              <w:rPr>
+                <w:rFonts w:ascii="Consolas" w:hAnsi="Consolas"/>
+              </w:rPr>
+              <w:t xml:space="preserve">F0 7D 4C 57 01 qq kk F7</w:t>
+            </w:r>
+            <w:r>
+              <w:t xml:space="preserve">, starting at kk = 00</w:t>
+            </w:r>
+          </w:p>
+        </w:tc>
+        <w:tc>
+          <w:tcPr>
+            <w:tcW w:w="3460" w:type="dxa"/>
+          </w:tcPr>
+          <w:p>
+            <w:pPr>
+              <w:spacing w:before="0" w:after="0"/>
+            </w:pPr>
+            <w:r>
+              <w:t xml:space="preserve">Each pedal saves kk + 1 as its position and passes the message on with kk + 1. The number that reaches Switchyard is the number of pedals</w:t>
+            </w:r>
+          </w:p>
+        </w:tc>
+      </w:tr>
+      <w:tr>
+        <w:trPr>
+          <w:cantSplit/>
+        </w:trPr>
+        <w:tc>
+          <w:tcPr>
+            <w:tcW w:w="2000" w:type="dxa"/>
+          </w:tcPr>
+          <w:p>
+            <w:pPr>
+              <w:spacing w:before="0" w:after="0"/>
+            </w:pPr>
+            <w:r>
+              <w:t xml:space="preserve">Identity request</w:t>
+            </w:r>
+          </w:p>
+        </w:tc>
+        <w:tc>
+          <w:tcPr>
+            <w:tcW w:w="3900" w:type="dxa"/>
+          </w:tcPr>
+          <w:p>
+            <w:pPr>
+              <w:spacing w:before="0" w:after="0"/>
+            </w:pPr>
+            <w:r>
+              <w:rPr>
+                <w:rFonts w:ascii="Consolas" w:hAnsi="Consolas"/>
+              </w:rPr>
+              <w:t xml:space="preserve">F0 7E 7F 06 01 F7</w:t>
+            </w:r>
+            <w:r>
+              <w:t xml:space="preserve"> (standard MIDI)</w:t>
+            </w:r>
+          </w:p>
+        </w:tc>
+        <w:tc>
+          <w:tcPr>
+            <w:tcW w:w="3460" w:type="dxa"/>
+          </w:tcPr>
+          <w:p>
+            <w:pPr>
+              <w:spacing w:before="0" w:after="0"/>
+            </w:pPr>
+            <w:r>
+              <w:t xml:space="preserve">Standard identity reply </w:t>
+            </w:r>
+            <w:r>
+              <w:rPr>
+                <w:rFonts w:ascii="Consolas" w:hAnsi="Consolas"/>
+              </w:rPr>
+              <w:t xml:space="preserve">F0 7E dd 06 02 7D 4C 57 m0 m1 aa bb cc ss F7</w:t>
+            </w:r>
+            <w:r>
+              <w:t xml:space="preserve">, then pedal info </w:t>
+            </w:r>
+            <w:r>
+              <w:rPr>
+                <w:rFonts w:ascii="Consolas" w:hAnsi="Consolas"/>
+              </w:rPr>
+              <w:t xml:space="preserve">F0 7D 4C 57 02 qq pp dd s0…s9 F7</w:t>
+            </w:r>
+          </w:p>
+        </w:tc>
+      </w:tr>
+      <w:tr>
+        <w:trPr>
+          <w:cantSplit/>
+        </w:trPr>
+        <w:tc>
+          <w:tcPr>
+            <w:tcW w:w="2000" w:type="dxa"/>
+          </w:tcPr>
+          <w:p>
+            <w:pPr>
+              <w:spacing w:before="0" w:after="0"/>
+            </w:pPr>
+            <w:r>
+              <w:t xml:space="preserve">Assign channel</w:t>
+            </w:r>
+          </w:p>
+        </w:tc>
+        <w:tc>
+          <w:tcPr>
+            <w:tcW w:w="3900" w:type="dxa"/>
+          </w:tcPr>
+          <w:p>
+            <w:pPr>
+              <w:spacing w:before="0" w:after="0"/>
+            </w:pPr>
+            <w:r>
+              <w:rPr>
+                <w:rFonts w:ascii="Consolas" w:hAnsi="Consolas"/>
+              </w:rPr>
+              <w:t xml:space="preserve">F0 7D 4C 57 03 qq s0…s9 ch F7</w:t>
+            </w:r>
+          </w:p>
+        </w:tc>
+        <w:tc>
+          <w:tcPr>
+            <w:tcW w:w="3460" w:type="dxa"/>
+          </w:tcPr>
+          <w:p>
+            <w:pPr>
+              <w:spacing w:before="0" w:after="0"/>
+            </w:pPr>
+            <w:r>
+              <w:t xml:space="preserve">If the serial is its own, the pedal saves the channel. Acknowledgement</w:t>
+            </w:r>
+          </w:p>
+        </w:tc>
+      </w:tr>
+      <w:tr>
+        <w:trPr>
+          <w:cantSplit/>
+        </w:trPr>
+        <w:tc>
+          <w:tcPr>
+            <w:tcW w:w="2000" w:type="dxa"/>
+          </w:tcPr>
+          <w:p>
+            <w:pPr>
+              <w:spacing w:before="0" w:after="0"/>
+            </w:pPr>
+            <w:r>
+              <w:t xml:space="preserve">Report settings</w:t>
+            </w:r>
+          </w:p>
+        </w:tc>
+        <w:tc>
+          <w:tcPr>
+            <w:tcW w:w="3900" w:type="dxa"/>
+          </w:tcPr>
+          <w:p>
+            <w:pPr>
+              <w:spacing w:before="0" w:after="0"/>
+            </w:pPr>
+            <w:r>
+              <w:rPr>
+                <w:rFonts w:ascii="Consolas" w:hAnsi="Consolas"/>
+              </w:rPr>
+              <w:t xml:space="preserve">F0 7D 4C 57 10 qq ch F7</w:t>
+            </w:r>
+          </w:p>
+        </w:tc>
+        <w:tc>
+          <w:tcPr>
+            <w:tcW w:w="3460" w:type="dxa"/>
+          </w:tcPr>
+          <w:p>
+            <w:pPr>
+              <w:spacing w:before="0" w:after="0"/>
+            </w:pPr>
+            <w:r>
+              <w:rPr>
+                <w:rFonts w:ascii="Consolas" w:hAnsi="Consolas"/>
+              </w:rPr>
+              <w:t xml:space="preserve">F0 7D 4C 57 11 qq ch (pairs) F7</w:t>
+            </w:r>
+          </w:p>
+        </w:tc>
+      </w:tr>
+      <w:tr>
+        <w:trPr>
+          <w:cantSplit/>
+        </w:trPr>
+        <w:tc>
+          <w:tcPr>
+            <w:tcW w:w="2000" w:type="dxa"/>
+          </w:tcPr>
+          <w:p>
+            <w:pPr>
+              <w:spacing w:before="0" w:after="0"/>
+            </w:pPr>
+            <w:r>
+              <w:t xml:space="preserve">Store preset</w:t>
+            </w:r>
+          </w:p>
+        </w:tc>
+        <w:tc>
+          <w:tcPr>
+            <w:tcW w:w="3900" w:type="dxa"/>
+          </w:tcPr>
+          <w:p>
+            <w:pPr>
+              <w:spacing w:before="0" w:after="0"/>
+            </w:pPr>
+            <w:r>
+              <w:rPr>
+                <w:rFonts w:ascii="Consolas" w:hAnsi="Consolas"/>
+              </w:rPr>
+              <w:t xml:space="preserve">F0 7D 4C 57 20 qq ch pp ff (pairs) F7</w:t>
+            </w:r>
+          </w:p>
+        </w:tc>
+        <w:tc>
+          <w:tcPr>
+            <w:tcW w:w="3460" w:type="dxa"/>
+          </w:tcPr>
+          <w:p>
+            <w:pPr>
+              <w:spacing w:before="0" w:after="0"/>
+            </w:pPr>
+            <w:r>
+              <w:t xml:space="preserve">Writes slot pp. ff = 0 stores the pairs sent; ff = 1 stores the current settings, and the message carries no pairs. Acknowledgement</w:t>
+            </w:r>
+          </w:p>
+        </w:tc>
+      </w:tr>
+      <w:tr>
+        <w:trPr>
+          <w:cantSplit/>
+        </w:trPr>
+        <w:tc>
+          <w:tcPr>
+            <w:tcW w:w="2000" w:type="dxa"/>
+          </w:tcPr>
+          <w:p>
+            <w:pPr>
+              <w:spacing w:before="0" w:after="0"/>
+            </w:pPr>
+            <w:r>
+              <w:t xml:space="preserve">Read preset</w:t>
+            </w:r>
+          </w:p>
+        </w:tc>
+        <w:tc>
+          <w:tcPr>
+            <w:tcW w:w="3900" w:type="dxa"/>
+          </w:tcPr>
+          <w:p>
+            <w:pPr>
+              <w:spacing w:before="0" w:after="0"/>
+            </w:pPr>
+            <w:r>
+              <w:rPr>
+                <w:rFonts w:ascii="Consolas" w:hAnsi="Consolas"/>
+              </w:rPr>
+              <w:t xml:space="preserve">F0 7D 4C 57 21 qq ch pp F7</w:t>
+            </w:r>
+          </w:p>
+        </w:tc>
+        <w:tc>
+          <w:tcPr>
+            <w:tcW w:w="3460" w:type="dxa"/>
+          </w:tcPr>
+          <w:p>
+            <w:pPr>
+              <w:spacing w:before="0" w:after="0"/>
+            </w:pPr>
+            <w:r>
+              <w:rPr>
+                <w:rFonts w:ascii="Consolas" w:hAnsi="Consolas"/>
+              </w:rPr>
+              <w:t xml:space="preserve">F0 7D 4C 57 22 qq ch pp (pairs) F7</w:t>
+            </w:r>
+          </w:p>
+        </w:tc>
+      </w:tr>
+      <w:tr>
+        <w:trPr>
+          <w:cantSplit/>
+        </w:trPr>
+        <w:tc>
+          <w:tcPr>
+            <w:tcW w:w="2000" w:type="dxa"/>
+          </w:tcPr>
+          <w:p>
+            <w:pPr>
+              <w:spacing w:before="0" w:after="0"/>
+            </w:pPr>
+            <w:r>
+              <w:t xml:space="preserve">Firmware: begin</w:t>
+            </w:r>
+          </w:p>
+        </w:tc>
+        <w:tc>
+          <w:tcPr>
+            <w:tcW w:w="3900" w:type="dxa"/>
+          </w:tcPr>
+          <w:p>
+            <w:pPr>
+              <w:spacing w:before="0" w:after="0"/>
+            </w:pPr>
+            <w:r>
+              <w:rPr>
+                <w:rFonts w:ascii="Consolas" w:hAnsi="Consolas"/>
+              </w:rPr>
+              <w:t xml:space="preserve">F0 7D 4C 57 30 qq s0…s9 z0 z1 z2 c0…c4 F7</w:t>
+            </w:r>
+          </w:p>
+        </w:tc>
+        <w:tc>
+          <w:tcPr>
+            <w:tcW w:w="3460" w:type="dxa"/>
+          </w:tcPr>
+          <w:p>
+            <w:pPr>
+              <w:spacing w:before="0" w:after="0"/>
+            </w:pPr>
+            <w:r>
+              <w:t xml:space="preserve">Goes to bypass and erases the spare copy. z = size in bytes, c = CRC-32 of the whole file. Acknowledgement once erased</w:t>
+            </w:r>
+          </w:p>
+        </w:tc>
+      </w:tr>
+      <w:tr>
+        <w:trPr>
+          <w:cantSplit/>
+        </w:trPr>
+        <w:tc>
+          <w:tcPr>
+            <w:tcW w:w="2000" w:type="dxa"/>
+          </w:tcPr>
+          <w:p>
+            <w:pPr>
+              <w:spacing w:before="0" w:after="0"/>
+            </w:pPr>
+            <w:r>
+              <w:t xml:space="preserve">Firmware: data</w:t>
+            </w:r>
+          </w:p>
+        </w:tc>
+        <w:tc>
+          <w:tcPr>
+            <w:tcW w:w="3900" w:type="dxa"/>
+          </w:tcPr>
+          <w:p>
+            <w:pPr>
+              <w:spacing w:before="0" w:after="0"/>
+            </w:pPr>
+            <w:r>
+              <w:rPr>
+                <w:rFonts w:ascii="Consolas" w:hAnsi="Consolas"/>
+              </w:rPr>
+              <w:t xml:space="preserve">F0 7D 4C 57 31 qq ch b0 b1 (74 bytes) xx F7</w:t>
+            </w:r>
+          </w:p>
+        </w:tc>
+        <w:tc>
+          <w:tcPr>
+            <w:tcW w:w="3460" w:type="dxa"/>
+          </w:tcPr>
+          <w:p>
+            <w:pPr>
+              <w:spacing w:before="0" w:after="0"/>
+            </w:pPr>
+            <w:r>
+              <w:t xml:space="preserve">Writes 64 bytes as block b0 b1. xx is a checksum of the block. Acknowledgement with the block number</w:t>
+            </w:r>
+          </w:p>
+        </w:tc>
+      </w:tr>
+      <w:tr>
+        <w:trPr>
+          <w:cantSplit/>
+        </w:trPr>
+        <w:tc>
+          <w:tcPr>
+            <w:tcW w:w="2000" w:type="dxa"/>
+          </w:tcPr>
+          <w:p>
+            <w:pPr>
+              <w:spacing w:before="0" w:after="0"/>
+            </w:pPr>
+            <w:r>
+              <w:t xml:space="preserve">Firmware: finish</w:t>
+            </w:r>
+          </w:p>
+        </w:tc>
+        <w:tc>
+          <w:tcPr>
+            <w:tcW w:w="3900" w:type="dxa"/>
+          </w:tcPr>
+          <w:p>
+            <w:pPr>
+              <w:spacing w:before="0" w:after="0"/>
+            </w:pPr>
+            <w:r>
+              <w:rPr>
+                <w:rFonts w:ascii="Consolas" w:hAnsi="Consolas"/>
+              </w:rPr>
+              <w:t xml:space="preserve">F0 7D 4C 57 32 qq ch F7</w:t>
+            </w:r>
+          </w:p>
+        </w:tc>
+        <w:tc>
+          <w:tcPr>
+            <w:tcW w:w="3460" w:type="dxa"/>
+          </w:tcPr>
+          <w:p>
+            <w:pPr>
+              <w:spacing w:before="0" w:after="0"/>
+            </w:pPr>
+            <w:r>
+              <w:t xml:space="preserve">Checks the CRC-32. If it matches, switches to the new copy and restarts. Acknowledgement, then a fresh identity reply</w:t>
+            </w:r>
+          </w:p>
+        </w:tc>
+      </w:tr>
+    </w:tbl>
+    <w:p>
+      <w:pPr/>
+    </w:p>
+    <w:p>
+      <w:pPr/>
+      <w:r>
+        <w:t xml:space="preserve">In the identity replies, </w:t>
+      </w:r>
+      <w:r>
+        <w:rPr>
+          <w:rFonts w:ascii="Consolas" w:hAnsi="Consolas"/>
+        </w:rPr>
+        <w:t xml:space="preserve">dd</w:t>
+      </w:r>
+      <w:r>
+        <w:t xml:space="preserve"> is the pedal’s channel (</w:t>
+      </w:r>
+      <w:r>
+        <w:rPr>
+          <w:rFonts w:ascii="Consolas" w:hAnsi="Consolas"/>
+        </w:rPr>
+        <w:t xml:space="preserve">7F</w:t>
+      </w:r>
+      <w:r>
+        <w:t xml:space="preserve"> until one is assigned), </w:t>
+      </w:r>
+      <w:r>
+        <w:rPr>
+          <w:rFonts w:ascii="Consolas" w:hAnsi="Consolas"/>
+        </w:rPr>
+        <w:t xml:space="preserve">m0 m1</w:t>
+      </w:r>
+      <w:r>
+        <w:t xml:space="preserve"> is the model number from its product document, </w:t>
+      </w:r>
+      <w:r>
+        <w:rPr>
+          <w:rFonts w:ascii="Consolas" w:hAnsi="Consolas"/>
+        </w:rPr>
+        <w:t xml:space="preserve">aa bb cc</w:t>
+      </w:r>
+      <w:r>
+        <w:t xml:space="preserve"> is the firmware version, </w:t>
+      </w:r>
+      <w:r>
+        <w:rPr>
+          <w:rFonts w:ascii="Consolas" w:hAnsi="Consolas"/>
+        </w:rPr>
+        <w:t xml:space="preserve">ss</w:t>
+      </w:r>
+      <w:r>
+        <w:t xml:space="preserve"> is the specification version, and </w:t>
+      </w:r>
+      <w:r>
+        <w:rPr>
+          <w:rFonts w:ascii="Consolas" w:hAnsi="Consolas"/>
+        </w:rPr>
+        <w:t xml:space="preserve">pp</w:t>
+      </w:r>
+      <w:r>
+        <w:t xml:space="preserve"> is the position.</w:t>
+      </w:r>
+    </w:p>
+    <w:p>
+      <w:pPr/>
+      <w:r>
+        <w:rPr>
+          <w:b/>
+        </w:rPr>
+        <w:t xml:space="preserve">Acknowledgement:</w:t>
+      </w:r>
+      <w:r>
+        <w:t xml:space="preserve"> </w:t>
+      </w:r>
+      <w:r>
+        <w:rPr>
+          <w:rFonts w:ascii="Consolas" w:hAnsi="Consolas"/>
+        </w:rPr>
+        <w:t xml:space="preserve">F0 7D 4C 57 7E qq ch cc st F7</w:t>
+      </w:r>
+      <w:r>
+        <w:t xml:space="preserve">, where </w:t>
+      </w:r>
+      <w:r>
+        <w:rPr>
+          <w:rFonts w:ascii="Consolas" w:hAnsi="Consolas"/>
+        </w:rPr>
+        <w:t xml:space="preserve">qq</w:t>
+      </w:r>
+      <w:r>
+        <w:t xml:space="preserve"> repeats the request’s sequence number, </w:t>
+      </w:r>
+      <w:r>
+        <w:rPr>
+          <w:rFonts w:ascii="Consolas" w:hAnsi="Consolas"/>
+        </w:rPr>
+        <w:t xml:space="preserve">cc</w:t>
+      </w:r>
+      <w:r>
+        <w:t xml:space="preserve"> repeats the command and </w:t>
+      </w:r>
+      <w:r>
+        <w:rPr>
+          <w:rFonts w:ascii="Consolas" w:hAnsi="Consolas"/>
+        </w:rPr>
+        <w:t xml:space="preserve">st</w:t>
+      </w:r>
+      <w:r>
+        <w:t xml:space="preserve"> is the result. Firmware data adds the block number before </w:t>
+      </w:r>
+      <w:r>
+        <w:rPr>
+          <w:rFonts w:ascii="Consolas" w:hAnsi="Consolas"/>
+        </w:rPr>
+        <w:t xml:space="preserve">F7</w:t>
+      </w:r>
+      <w:r>
+        <w:t xml:space="preserve">.</w:t>
+      </w:r>
+    </w:p>
+    <w:tbl>
+      <w:tblPr>
+        <w:tblW w:w="9360" w:type="dxa"/>
+        <w:tblBorders>
+          <w:top w:val="single" w:sz="4" w:space="0" w:color="A0A0A0"/>
+          <w:left w:val="single" w:sz="4" w:space="0" w:color="A0A0A0"/>
+          <w:bottom w:val="single" w:sz="4" w:space="0" w:color="A0A0A0"/>
+          <w:right w:val="single" w:sz="4" w:space="0" w:color="A0A0A0"/>
+          <w:insideH w:val="single" w:sz="4" w:space="0" w:color="A0A0A0"/>
+          <w:insideV w:val="single" w:sz="4" w:space="0" w:color="A0A0A0"/>
+        </w:tblBorders>
+        <w:tblLayout w:type="fixed"/>
+        <w:tblCellMar>
+          <w:top w:w="40" w:type="dxa"/>
+          <w:left w:w="100" w:type="dxa"/>
+          <w:bottom w:w="40" w:type="dxa"/>
+          <w:right w:w="100" w:type="dxa"/>
+        </w:tblCellMar>
+      </w:tblPr>
+      <w:tblGrid>
+        <w:gridCol w:w="1200"/>
+        <w:gridCol w:w="8160"/>
+      </w:tblGrid>
+      <w:tr>
+        <w:trPr>
+          <w:cantSplit/>
+          <w:tblHeader/>
+        </w:trPr>
+        <w:tc>
+          <w:tcPr>
+            <w:tcW w:w="1200" w:type="dxa"/>
+            <w:shd w:val="clear" w:color="auto" w:fill="E7E6E6"/>
+          </w:tcPr>
+          <w:p>
+            <w:pPr>
+              <w:spacing w:before="0" w:after="0"/>
+            </w:pPr>
+            <w:r>
+              <w:rPr>
+                <w:b/>
+              </w:rPr>
+              <w:t xml:space="preserve">st</w:t>
+            </w:r>
+          </w:p>
+        </w:tc>
+        <w:tc>
+          <w:tcPr>
+            <w:tcW w:w="8160" w:type="dxa"/>
+            <w:shd w:val="clear" w:color="auto" w:fill="E7E6E6"/>
+          </w:tcPr>
+          <w:p>
+            <w:pPr>
+              <w:spacing w:before="0" w:after="0"/>
+            </w:pPr>
+            <w:r>
+              <w:rPr>
+                <w:b/>
+              </w:rPr>
+              <w:t xml:space="preserve">Meaning</w:t>
+            </w:r>
+          </w:p>
+        </w:tc>
+      </w:tr>
+      <w:tr>
+        <w:trPr>
+          <w:cantSplit/>
+        </w:trPr>
+        <w:tc>
+          <w:tcPr>
+            <w:tcW w:w="1200" w:type="dxa"/>
+          </w:tcPr>
+          <w:p>
+            <w:pPr>
+              <w:spacing w:before="0" w:after="0"/>
+            </w:pPr>
+            <w:r>
+              <w:t xml:space="preserve">00</w:t>
+            </w:r>
+          </w:p>
+        </w:tc>
+        <w:tc>
+          <w:tcPr>
+            <w:tcW w:w="8160" w:type="dxa"/>
+          </w:tcPr>
+          <w:p>
+            <w:pPr>
+              <w:spacing w:before="0" w:after="0"/>
+            </w:pPr>
+            <w:r>
+              <w:t xml:space="preserve">OK</w:t>
+            </w:r>
+          </w:p>
+        </w:tc>
+      </w:tr>
+      <w:tr>
+        <w:trPr>
+          <w:cantSplit/>
+        </w:trPr>
+        <w:tc>
+          <w:tcPr>
+            <w:tcW w:w="1200" w:type="dxa"/>
+          </w:tcPr>
+          <w:p>
+            <w:pPr>
+              <w:spacing w:before="0" w:after="0"/>
+            </w:pPr>
+            <w:r>
+              <w:t xml:space="preserve">01</w:t>
+            </w:r>
+          </w:p>
+        </w:tc>
+        <w:tc>
+          <w:tcPr>
+            <w:tcW w:w="8160" w:type="dxa"/>
+          </w:tcPr>
+          <w:p>
+            <w:pPr>
+              <w:spacing w:before="0" w:after="0"/>
+            </w:pPr>
+            <w:r>
+              <w:t xml:space="preserve">Unknown command</w:t>
+            </w:r>
+          </w:p>
+        </w:tc>
+      </w:tr>
+      <w:tr>
+        <w:trPr>
+          <w:cantSplit/>
+        </w:trPr>
+        <w:tc>
+          <w:tcPr>
+            <w:tcW w:w="1200" w:type="dxa"/>
+          </w:tcPr>
+          <w:p>
+            <w:pPr>
+              <w:spacing w:before="0" w:after="0"/>
+            </w:pPr>
+            <w:r>
+              <w:t xml:space="preserve">02</w:t>
+            </w:r>
+          </w:p>
+        </w:tc>
+        <w:tc>
+          <w:tcPr>
+            <w:tcW w:w="8160" w:type="dxa"/>
+          </w:tcPr>
+          <w:p>
+            <w:pPr>
+              <w:spacing w:before="0" w:after="0"/>
+            </w:pPr>
+            <w:r>
+              <w:t xml:space="preserve">Value out of range (such as a slot above 127)</w:t>
+            </w:r>
+          </w:p>
+        </w:tc>
+      </w:tr>
+      <w:tr>
+        <w:trPr>
+          <w:cantSplit/>
+        </w:trPr>
+        <w:tc>
+          <w:tcPr>
+            <w:tcW w:w="1200" w:type="dxa"/>
+          </w:tcPr>
+          <w:p>
+            <w:pPr>
+              <w:spacing w:before="0" w:after="0"/>
+            </w:pPr>
+            <w:r>
+              <w:t xml:space="preserve">03</w:t>
+            </w:r>
+          </w:p>
+        </w:tc>
+        <w:tc>
+          <w:tcPr>
+            <w:tcW w:w="8160" w:type="dxa"/>
+          </w:tcPr>
+          <w:p>
+            <w:pPr>
+              <w:spacing w:before="0" w:after="0"/>
+            </w:pPr>
+            <w:r>
+              <w:t xml:space="preserve">Checksum failed; Switchyard resends</w:t>
+            </w:r>
+          </w:p>
+        </w:tc>
+      </w:tr>
+      <w:tr>
+        <w:trPr>
+          <w:cantSplit/>
+        </w:trPr>
+        <w:tc>
+          <w:tcPr>
+            <w:tcW w:w="1200" w:type="dxa"/>
+          </w:tcPr>
+          <w:p>
+            <w:pPr>
+              <w:spacing w:before="0" w:after="0"/>
+            </w:pPr>
+            <w:r>
+              <w:t xml:space="preserve">04</w:t>
+            </w:r>
+          </w:p>
+        </w:tc>
+        <w:tc>
+          <w:tcPr>
+            <w:tcW w:w="8160" w:type="dxa"/>
+          </w:tcPr>
+          <w:p>
+            <w:pPr>
+              <w:spacing w:before="0" w:after="0"/>
+            </w:pPr>
+            <w:r>
+              <w:t xml:space="preserve">Busy; Switchyard waits and resends</w:t>
+            </w:r>
+          </w:p>
+        </w:tc>
+      </w:tr>
+      <w:tr>
+        <w:trPr>
+          <w:cantSplit/>
+        </w:trPr>
+        <w:tc>
+          <w:tcPr>
+            <w:tcW w:w="1200" w:type="dxa"/>
+          </w:tcPr>
+          <w:p>
+            <w:pPr>
+              <w:spacing w:before="0" w:after="0"/>
+            </w:pPr>
+            <w:r>
+              <w:t xml:space="preserve">05</w:t>
+            </w:r>
+          </w:p>
+        </w:tc>
+        <w:tc>
+          <w:tcPr>
+            <w:tcW w:w="8160" w:type="dxa"/>
+          </w:tcPr>
+          <w:p>
+            <w:pPr>
+              <w:spacing w:before="0" w:after="0"/>
+            </w:pPr>
+            <w:r>
+              <w:t xml:space="preserve">Firmware check failed; the old version keeps running</w:t>
+            </w:r>
+          </w:p>
+        </w:tc>
+      </w:tr>
+    </w:tbl>
+    <w:p>
+      <w:pPr/>
+    </w:p>
+    <w:p>
+      <w:pPr/>
+      <w:r>
+        <w:rPr>
+          <w:b/>
+        </w:rPr>
+        <w:t xml:space="preserve">Firmware packing:</w:t>
+      </w:r>
+      <w:r>
+        <w:t xml:space="preserve"> MIDI data bytes only go up to 127, but firmware bytes go to 255. Every 7 firmware bytes travel as 8 MIDI bytes, with the extra byte carrying the top bits, so 64 bytes take 74. A block takes about 27 ms to send.</w:t>
+      </w:r>
+    </w:p>
+    <w:p>
+      <w:r>
+        <w:rPr>
+          <w:b/>
+        </w:rPr>
         <w:t xml:space="preserve">Manufacturer ID:</w:t>
       </w:r>
       <w:r>
         <w:t xml:space="preserve"> MIDI reserves a temporary ID (7D) for development and non-commercial use, which we can use while prototyping. Before selling, we need our own ID from the MIDI Association, which has a small annual fee.</w:t>
+      </w:r>
+      <w:r>
+        <w:t xml:space="preserve"> Our own ID will be 3 bytes (</w:t>
+      </w:r>
+      <w:r>
+        <w:rPr>
+          <w:rFonts w:ascii="Consolas" w:hAnsi="Consolas"/>
+        </w:rPr>
+        <w:t xml:space="preserve">00 xx yy</w:t>
+      </w:r>
+      <w:r>
+        <w:t xml:space="preserve">), which moves every later byte 2 places. Firmware and Switchyard code should keep the header (</w:t>
+      </w:r>
+      <w:r>
+        <w:rPr>
+          <w:rFonts w:ascii="Consolas" w:hAnsi="Consolas"/>
+        </w:rPr>
+        <w:t xml:space="preserve">F0 7D 4C 57</w:t>
+      </w:r>
+      <w:r>
+        <w:t xml:space="preserve"> for now) as one named constant and count byte positions from its end, never hard-code them.</w:t>
       </w:r>
     </w:p>
     <w:p>

</xml_diff>

<commit_message>
Record Switchyard feature decisions
Update the Switchyard product document with the October 2026 decisions:
keep-alive phone charging, running from phone power, LED song/part
readout with the phone as main display, no hold actions, and per-pedal
deduplicated presets. Make the deduplicated setlist scheme a firm rule
in the Linework Control Specification.

Co-Authored-By: Claude Opus 5.5 <noreply@anthropic.com>
</commit_message>
<xml_diff>
--- a/Linework Control Specification.docx
+++ b/Linework Control Specification.docx
@@ -2670,10 +2670,28 @@
         <w:rPr>
           <w:b/>
         </w:rPr>
-        <w:t xml:space="preserve">Proposal for setlists:</w:t>
-      </w:r>
-      <w:r>
-        <w:t xml:space="preserve"> when the app sends a setlist to Switchyard, it stores the settings each song part needs as presets in each pedal. Stepping to the next part then needs only one program change message per pedal. Switchyard can still send individual control change messages for live adjustments.</w:t>
+        <w:t xml:space="preserve">Setlists:</w:t>
+      </w:r>
+      <w:r>
+        <w:t xml:space="preserve"> when the app sends a setlist to Switchyard, it looks at every song part and stores each pedal’s different settings as that pedal’s presets, with no duplicates. Switchyard stores which preset each pedal uses for each part. Stepping to the next part then needs only one program change message per pedal, each carrying that pedal’s own preset number. Switchyard can still send individual control change messages for live adjustments.</w:t>
+      </w:r>
+    </w:p>
+    <w:p>
+      <w:pPr>
+        <w:pStyle w:val="ListParagraph"/>
+        <w:numPr>
+          <w:ilvl w:val="0"/>
+          <w:numId w:val="90"/>
+        </w:numPr>
+      </w:pPr>
+      <w:r>
+        <w:rPr>
+          <w:b/>
+        </w:rPr>
+        <w:t xml:space="preserve">Preset limit:</w:t>
+      </w:r>
+      <w:r>
+        <w:t xml:space="preserve"> because repeated sounds share a slot, the limit is 128 different sounds per pedal, not 128 song parts. A setlist can hold far more parts than that.</w:t>
       </w:r>
     </w:p>
     <w:p>
@@ -2910,30 +2928,6 @@
       </w:pPr>
       <w:r>
         <w:t xml:space="preserve">Is the fine-adjustment range (control change 52–59) needed for any pedal, or is 128 steps enough?</w:t>
-      </w:r>
-    </w:p>
-    <w:p>
-      <w:pPr>
-        <w:pStyle w:val="ListParagraph"/>
-        <w:numPr>
-          <w:ilvl w:val="0"/>
-          <w:numId w:val="90"/>
-        </w:numPr>
-      </w:pPr>
-      <w:r>
-        <w:t xml:space="preserve">Confirm the setlist proposal: presets in the pedals, recalled by program change.</w:t>
-      </w:r>
-    </w:p>
-    <w:p>
-      <w:pPr>
-        <w:pStyle w:val="ListParagraph"/>
-        <w:numPr>
-          <w:ilvl w:val="0"/>
-          <w:numId w:val="90"/>
-        </w:numPr>
-      </w:pPr>
-      <w:r>
-        <w:t xml:space="preserve">Should Switchyard offer a second loop for very large boards?</w:t>
       </w:r>
     </w:p>
     <w:sectPr>

</xml_diff>

<commit_message>
Add the phone and Switchyard messages to the Linework spec (v0.2 draft)
New "Phone and Switchyard" section: USB MIDI routing, split sequence
numbers, scan loop, the setlist format and upload, live position and
jump, and sending to other brands' pedals. Adds loop break finding
(Active Sensing heartbeat plus a pedal Loop break report), result codes
06 and 07, Switchyard firmware updates over USB, and a Glossary. The
Flashover MIDI reference picks up the pedal-side rules.

Co-Authored-By: Claude Opus 5.5 <noreply@anthropic.com>
</commit_message>
<xml_diff>
--- a/Linework Control Specification.docx
+++ b/Linework Control Specification.docx
@@ -107,7 +107,7 @@
               <w:spacing w:before="0" w:after="0"/>
             </w:pPr>
             <w:r>
-              <w:t xml:space="preserve">0.1 (draft)</w:t>
+              <w:t xml:space="preserve">0.2 (draft)</w:t>
             </w:r>
           </w:p>
         </w:tc>
@@ -138,7 +138,7 @@
               <w:spacing w:before="0" w:after="0"/>
             </w:pPr>
             <w:r>
-              <w:t xml:space="preserve">First proposal, to be refined as each pedal is designed</w:t>
+              <w:t xml:space="preserve">Draft. Version 0.2 (October 2026) adds the phone and Switchyard messages and finding a break in the loop</w:t>
             </w:r>
           </w:p>
         </w:tc>
@@ -601,7 +601,7 @@
         <w:t xml:space="preserve">Switchyard detects the break</w:t>
       </w:r>
       <w:r>
-        <w:t xml:space="preserve"> because its messages stop coming back around the loop, and the app shows which pedal to check.</w:t>
+        <w:t xml:space="preserve"> because its messages stop coming back around the loop. Pedals after the break report that their input has gone quiet, so the app can show which pedal or cable to check. See “Finding a break in the loop” under Phone and Switchyard.</w:t>
       </w:r>
     </w:p>
     <w:p>
@@ -1466,6 +1466,50 @@
           </w:p>
         </w:tc>
       </w:tr>
+      <w:tr>
+        <w:trPr>
+          <w:cantSplit/>
+        </w:trPr>
+        <w:tc>
+          <w:tcPr>
+            <w:tcW w:w="2400" w:type="dxa"/>
+          </w:tcPr>
+          <w:p>
+            <w:pPr>
+              <w:spacing w:before="0" w:after="0"/>
+            </w:pPr>
+            <w:r>
+              <w:t xml:space="preserve">Loop break report</w:t>
+            </w:r>
+          </w:p>
+        </w:tc>
+        <w:tc>
+          <w:tcPr>
+            <w:tcW w:w="2560" w:type="dxa"/>
+          </w:tcPr>
+          <w:p>
+            <w:pPr>
+              <w:spacing w:before="0" w:after="0"/>
+            </w:pPr>
+            <w:r>
+              <w:t xml:space="preserve">Pedal → Switchyard</w:t>
+            </w:r>
+          </w:p>
+        </w:tc>
+        <w:tc>
+          <w:tcPr>
+            <w:tcW w:w="4400" w:type="dxa"/>
+          </w:tcPr>
+          <w:p>
+            <w:pPr>
+              <w:spacing w:before="0" w:after="0"/>
+            </w:pPr>
+            <w:r>
+              <w:t xml:space="preserve">Sent by a pedal whose MIDI in has gone quiet, so Switchyard can tell where the loop is broken</w:t>
+            </w:r>
+          </w:p>
+        </w:tc>
+      </w:tr>
     </w:tbl>
     <w:p/>
     <w:p>
@@ -1566,16 +1610,70 @@
         <w:t xml:space="preserve">qq</w:t>
       </w:r>
       <w:r>
-        <w:t xml:space="preserve"> is a sequence number, 00–7F. Switchyard counts it up with each request, going from 7F back to 00, and every answer repeats it. That way a lost or late answer is never matched to the wrong request. Pedal info answers the standard identity request, which has no </w:t>
+        <w:t xml:space="preserve"> is a sequence number. Every answer repeats the request’s number, so a lost or late answer is never matched to the wrong request. Switchyard’s own requests use </w:t>
       </w:r>
       <w:r>
         <w:rPr>
           <w:rFonts w:ascii="Consolas" w:hAnsi="Consolas"/>
         </w:rPr>
-        <w:t xml:space="preserve">qq</w:t>
-      </w:r>
-      <w:r>
-        <w:t xml:space="preserve">, so it sends 00.</w:t>
+        <w:t xml:space="preserve">00</w:t>
+      </w:r>
+      <w:r>
+        <w:t xml:space="preserve">–</w:t>
+      </w:r>
+      <w:r>
+        <w:rPr>
+          <w:rFonts w:ascii="Consolas" w:hAnsi="Consolas"/>
+        </w:rPr>
+        <w:t xml:space="preserve">3F</w:t>
+      </w:r>
+      <w:r>
+        <w:t xml:space="preserve">, counting up and going from </w:t>
+      </w:r>
+      <w:r>
+        <w:rPr>
+          <w:rFonts w:ascii="Consolas" w:hAnsi="Consolas"/>
+        </w:rPr>
+        <w:t xml:space="preserve">3F</w:t>
+      </w:r>
+      <w:r>
+        <w:t xml:space="preserve"> back to </w:t>
+      </w:r>
+      <w:r>
+        <w:rPr>
+          <w:rFonts w:ascii="Consolas" w:hAnsi="Consolas"/>
+        </w:rPr>
+        <w:t xml:space="preserve">00</w:t>
+      </w:r>
+      <w:r>
+        <w:t xml:space="preserve">. Requests the app sends through Switchyard use </w:t>
+      </w:r>
+      <w:r>
+        <w:rPr>
+          <w:rFonts w:ascii="Consolas" w:hAnsi="Consolas"/>
+        </w:rPr>
+        <w:t xml:space="preserve">40</w:t>
+      </w:r>
+      <w:r>
+        <w:t xml:space="preserve">–</w:t>
+      </w:r>
+      <w:r>
+        <w:rPr>
+          <w:rFonts w:ascii="Consolas" w:hAnsi="Consolas"/>
+        </w:rPr>
+        <w:t xml:space="preserve">7F</w:t>
+      </w:r>
+      <w:r>
+        <w:t xml:space="preserve"> (see Phone and Switchyard). Messages that answer no request, such as pedal info and reports, send </w:t>
+      </w:r>
+      <w:r>
+        <w:rPr>
+          <w:rFonts w:ascii="Consolas" w:hAnsi="Consolas"/>
+        </w:rPr>
+        <w:t xml:space="preserve">00</w:t>
+      </w:r>
+      <w:r>
+        <w:t xml:space="preserve">.</w:t>
       </w:r>
     </w:p>
     <w:p>
@@ -2181,6 +2279,65 @@
           </w:p>
         </w:tc>
       </w:tr>
+      <w:tr>
+        <w:trPr>
+          <w:cantSplit/>
+        </w:trPr>
+        <w:tc>
+          <w:tcPr>
+            <w:tcW w:w="2000" w:type="dxa"/>
+          </w:tcPr>
+          <w:p>
+            <w:pPr>
+              <w:spacing w:before="0" w:after="0"/>
+            </w:pPr>
+            <w:r>
+              <w:t xml:space="preserve">Loop break report</w:t>
+            </w:r>
+          </w:p>
+        </w:tc>
+        <w:tc>
+          <w:tcPr>
+            <w:tcW w:w="3900" w:type="dxa"/>
+          </w:tcPr>
+          <w:p>
+            <w:pPr>
+              <w:spacing w:before="0" w:after="0"/>
+            </w:pPr>
+            <w:r>
+              <w:t xml:space="preserve">(Switchyard sends nothing; the pedal sends this itself)</w:t>
+            </w:r>
+          </w:p>
+        </w:tc>
+        <w:tc>
+          <w:tcPr>
+            <w:tcW w:w="3460" w:type="dxa"/>
+          </w:tcPr>
+          <w:p>
+            <w:pPr>
+              <w:spacing w:before="0" w:after="0"/>
+            </w:pPr>
+            <w:r>
+              <w:rPr>
+                <w:rFonts w:ascii="Consolas" w:hAnsi="Consolas"/>
+              </w:rPr>
+              <w:t xml:space="preserve">F0 7D 4C 57 08 00 pp F7</w:t>
+            </w:r>
+            <w:r>
+              <w:t xml:space="preserve">, once a second while its MIDI in stays quiet. </w:t>
+            </w:r>
+            <w:r>
+              <w:rPr>
+                <w:rFonts w:ascii="Consolas" w:hAnsi="Consolas"/>
+              </w:rPr>
+              <w:t xml:space="preserve">pp</w:t>
+            </w:r>
+            <w:r>
+              <w:t xml:space="preserve"> is its position</w:t>
+            </w:r>
+          </w:p>
+        </w:tc>
+      </w:tr>
     </w:tbl>
     <w:p>
       <w:pPr/>
@@ -2290,7 +2447,7 @@
         <w:t xml:space="preserve">st</w:t>
       </w:r>
       <w:r>
-        <w:t xml:space="preserve"> is the result. Firmware data adds the block number before </w:t>
+        <w:t xml:space="preserve"> is the result. When Switchyard itself answers the app, ch is 7F, which is never a pedal channel. Firmware data adds the block number before </w:t>
       </w:r>
       <w:r>
         <w:rPr>
@@ -2551,6 +2708,68 @@
           </w:p>
         </w:tc>
       </w:tr>
+      <w:tr>
+        <w:trPr>
+          <w:cantSplit/>
+        </w:trPr>
+        <w:tc>
+          <w:tcPr>
+            <w:tcW w:w="1200" w:type="dxa"/>
+          </w:tcPr>
+          <w:p>
+            <w:pPr>
+              <w:spacing w:before="0" w:after="0"/>
+            </w:pPr>
+            <w:r>
+              <w:t xml:space="preserve">06</w:t>
+            </w:r>
+          </w:p>
+        </w:tc>
+        <w:tc>
+          <w:tcPr>
+            <w:tcW w:w="8160" w:type="dxa"/>
+          </w:tcPr>
+          <w:p>
+            <w:pPr>
+              <w:spacing w:before="0" w:after="0"/>
+            </w:pPr>
+            <w:r>
+              <w:t xml:space="preserve">No setlist loaded (Switchyard only)</w:t>
+            </w:r>
+          </w:p>
+        </w:tc>
+      </w:tr>
+      <w:tr>
+        <w:trPr>
+          <w:cantSplit/>
+        </w:trPr>
+        <w:tc>
+          <w:tcPr>
+            <w:tcW w:w="1200" w:type="dxa"/>
+          </w:tcPr>
+          <w:p>
+            <w:pPr>
+              <w:spacing w:before="0" w:after="0"/>
+            </w:pPr>
+            <w:r>
+              <w:t xml:space="preserve">07</w:t>
+            </w:r>
+          </w:p>
+        </w:tc>
+        <w:tc>
+          <w:tcPr>
+            <w:tcW w:w="8160" w:type="dxa"/>
+          </w:tcPr>
+          <w:p>
+            <w:pPr>
+              <w:spacing w:before="0" w:after="0"/>
+            </w:pPr>
+            <w:r>
+              <w:t xml:space="preserve">Setlist check failed; the old setlist stays (Switchyard only)</w:t>
+            </w:r>
+          </w:p>
+        </w:tc>
+      </w:tr>
     </w:tbl>
     <w:p>
       <w:pPr/>
@@ -2699,7 +2918,21 @@
         <w:pStyle w:val="Heading1"/>
       </w:pPr>
       <w:r>
-        <w:t xml:space="preserve">Firmware updates</w:t>
+        <w:t xml:space="preserve">Phone and Switchyard</w:t>
+      </w:r>
+    </w:p>
+    <w:p>
+      <w:pPr/>
+      <w:r>
+        <w:t xml:space="preserve">The phone app talks to Switchyard over USB. Switchyard appears to the phone as a standard USB MIDI device with one port, so the app uses the MIDI support built into iPhone and Android, with no drivers (see “USB MIDI” in the Glossary). Every message uses the frame and conventions in Byte layouts above.</w:t>
+      </w:r>
+    </w:p>
+    <w:p>
+      <w:pPr>
+        <w:pStyle w:val="Heading2"/>
+      </w:pPr>
+      <w:r>
+        <w:t xml:space="preserve">How messages are routed</w:t>
       </w:r>
     </w:p>
     <w:p>
@@ -2714,10 +2947,36 @@
         <w:rPr>
           <w:b/>
         </w:rPr>
-        <w:t xml:space="preserve">Route:</w:t>
-      </w:r>
-      <w:r>
-        <w:t xml:space="preserve"> the app downloads firmware from the Greywire server, sends it to Switchyard over USB, and Switchyard sends it around the MIDI loop addressed to one pedal by serial number. The pedal confirms each part and reports when it’s finished.</w:t>
+        <w:t xml:space="preserve">Commands </w:t>
+      </w:r>
+      <w:r>
+        <w:rPr>
+          <w:rFonts w:ascii="Consolas" w:hAnsi="Consolas"/>
+          <w:b/>
+        </w:rPr>
+        <w:t xml:space="preserve">40</w:t>
+      </w:r>
+      <w:r>
+        <w:rPr>
+          <w:b/>
+        </w:rPr>
+        <w:t xml:space="preserve">–</w:t>
+      </w:r>
+      <w:r>
+        <w:rPr>
+          <w:rFonts w:ascii="Consolas" w:hAnsi="Consolas"/>
+          <w:b/>
+        </w:rPr>
+        <w:t xml:space="preserve">5F</w:t>
+      </w:r>
+      <w:r>
+        <w:rPr>
+          <w:b/>
+        </w:rPr>
+        <w:t xml:space="preserve"> are for Switchyard itself.</w:t>
+      </w:r>
+      <w:r>
+        <w:t xml:space="preserve"> It acts on them and answers the app.</w:t>
       </w:r>
     </w:p>
     <w:p>
@@ -2732,10 +2991,28 @@
         <w:rPr>
           <w:b/>
         </w:rPr>
-        <w:t xml:space="preserve">Protected:</w:t>
-      </w:r>
-      <w:r>
-        <w:t xml:space="preserve"> each pedal keeps two copies of its firmware. Updates go into the spare copy and are checked before the pedal switches over. A failed or interrupted update leaves the old version running.</w:t>
+        <w:t xml:space="preserve">Every other Linework system message from the app goes into the loop unchanged.</w:t>
+      </w:r>
+      <w:r>
+        <w:t xml:space="preserve"> That covers commands </w:t>
+      </w:r>
+      <w:r>
+        <w:rPr>
+          <w:rFonts w:ascii="Consolas" w:hAnsi="Consolas"/>
+        </w:rPr>
+        <w:t xml:space="preserve">00</w:t>
+      </w:r>
+      <w:r>
+        <w:t xml:space="preserve">–</w:t>
+      </w:r>
+      <w:r>
+        <w:rPr>
+          <w:rFonts w:ascii="Consolas" w:hAnsi="Consolas"/>
+        </w:rPr>
+        <w:t xml:space="preserve">3F</w:t>
+      </w:r>
+      <w:r>
+        <w:t xml:space="preserve">, such as Report settings, Store preset, Read preset and a pedal’s firmware update. The pedal’s answer comes back around the loop, and Switchyard passes it to the app.</w:t>
       </w:r>
     </w:p>
     <w:p>
@@ -2750,10 +3027,10 @@
         <w:rPr>
           <w:b/>
         </w:rPr>
-        <w:t xml:space="preserve">Recovery mode:</w:t>
-      </w:r>
-      <w:r>
-        <w:t xml:space="preserve"> each pedal has a button combination at power-up that starts a minimal recovery program waiting for a new update. Each product document lists its combination.</w:t>
+        <w:t xml:space="preserve">Program change and control change messages from the app also go into the loop,</w:t>
+      </w:r>
+      <w:r>
+        <w:t xml:space="preserve"> so the app can try out a preset or adjust a pedal live.</w:t>
       </w:r>
     </w:p>
     <w:p>
@@ -2768,10 +3045,10 @@
         <w:rPr>
           <w:b/>
         </w:rPr>
-        <w:t xml:space="preserve">During an update</w:t>
-      </w:r>
-      <w:r>
-        <w:t xml:space="preserve"> the pedal stays in bypass, so the guitar signal still passes.</w:t>
+        <w:t xml:space="preserve">Everything that reaches Switchyard’s MIDI in is passed to the app</w:t>
+      </w:r>
+      <w:r>
+        <w:t xml:space="preserve"> while it’s connected, including a pedal’s report when a knob is turned by hand. Active Sensing is the one exception: Switchyard keeps that to itself.</w:t>
       </w:r>
     </w:p>
     <w:p>
@@ -2786,10 +3063,10 @@
         <w:rPr>
           <w:b/>
         </w:rPr>
-        <w:t xml:space="preserve">Speed:</w:t>
-      </w:r>
-      <w:r>
-        <w:t xml:space="preserve"> MIDI moves about 3 KB per second, so a typical update of 100–200 KB takes one to two minutes per pedal.</w:t>
+        <w:t xml:space="preserve">Nothing from Switchyard’s MIDI in goes back out into the loop.</w:t>
+      </w:r>
+      <w:r>
+        <w:t xml:space="preserve"> The loop ends at Switchyard.</w:t>
       </w:r>
     </w:p>
     <w:p>
@@ -2804,18 +3081,27 @@
         <w:rPr>
           <w:b/>
         </w:rPr>
-        <w:t xml:space="preserve">Switchyard itself</w:t>
-      </w:r>
-      <w:r>
-        <w:t xml:space="preserve"> is updated directly over USB from the app.</w:t>
-      </w:r>
-    </w:p>
-    <w:p>
-      <w:pPr>
-        <w:pStyle w:val="Heading1"/>
-      </w:pPr>
-      <w:r>
-        <w:t xml:space="preserve">Timing</w:t>
+        <w:t xml:space="preserve">The standard identity request</w:t>
+      </w:r>
+      <w:r>
+        <w:t xml:space="preserve"> from the app is answered by Switchyard itself, with model number </w:t>
+      </w:r>
+      <w:r>
+        <w:rPr>
+          <w:rFonts w:ascii="Consolas" w:hAnsi="Consolas"/>
+        </w:rPr>
+        <w:t xml:space="preserve">02 00</w:t>
+      </w:r>
+      <w:r>
+        <w:t xml:space="preserve">. The app finds the pedals with Scan loop instead.</w:t>
+      </w:r>
+    </w:p>
+    <w:p>
+      <w:pPr>
+        <w:pStyle w:val="Heading2"/>
+      </w:pPr>
+      <w:r>
+        <w:t xml:space="preserve">Sequence numbers and pacing</w:t>
       </w:r>
     </w:p>
     <w:p>
@@ -2827,7 +3113,70 @@
         </w:numPr>
       </w:pPr>
       <w:r>
-        <w:t xml:space="preserve">A control change message takes about 1 ms to send.</w:t>
+        <w:t xml:space="preserve">The app and Switchyard share the loop, so they split the sequence numbers: Switchyard’s own requests use </w:t>
+      </w:r>
+      <w:r>
+        <w:rPr>
+          <w:rFonts w:ascii="Consolas" w:hAnsi="Consolas"/>
+        </w:rPr>
+        <w:t xml:space="preserve">00</w:t>
+      </w:r>
+      <w:r>
+        <w:t xml:space="preserve">–</w:t>
+      </w:r>
+      <w:r>
+        <w:rPr>
+          <w:rFonts w:ascii="Consolas" w:hAnsi="Consolas"/>
+        </w:rPr>
+        <w:t xml:space="preserve">3F</w:t>
+      </w:r>
+      <w:r>
+        <w:t xml:space="preserve"> and the app’s use </w:t>
+      </w:r>
+      <w:r>
+        <w:rPr>
+          <w:rFonts w:ascii="Consolas" w:hAnsi="Consolas"/>
+        </w:rPr>
+        <w:t xml:space="preserve">40</w:t>
+      </w:r>
+      <w:r>
+        <w:t xml:space="preserve">–</w:t>
+      </w:r>
+      <w:r>
+        <w:rPr>
+          <w:rFonts w:ascii="Consolas" w:hAnsi="Consolas"/>
+        </w:rPr>
+        <w:t xml:space="preserve">7F</w:t>
+      </w:r>
+      <w:r>
+        <w:t xml:space="preserve">, counting up from </w:t>
+      </w:r>
+      <w:r>
+        <w:rPr>
+          <w:rFonts w:ascii="Consolas" w:hAnsi="Consolas"/>
+        </w:rPr>
+        <w:t xml:space="preserve">40</w:t>
+      </w:r>
+      <w:r>
+        <w:t xml:space="preserve"> and going from </w:t>
+      </w:r>
+      <w:r>
+        <w:rPr>
+          <w:rFonts w:ascii="Consolas" w:hAnsi="Consolas"/>
+        </w:rPr>
+        <w:t xml:space="preserve">7F</w:t>
+      </w:r>
+      <w:r>
+        <w:t xml:space="preserve"> back to </w:t>
+      </w:r>
+      <w:r>
+        <w:rPr>
+          <w:rFonts w:ascii="Consolas" w:hAnsi="Consolas"/>
+        </w:rPr>
+        <w:t xml:space="preserve">40</w:t>
+      </w:r>
+      <w:r>
+        <w:t xml:space="preserve">. Switchyard can tell straight away whether an answer from a pedal belongs to it or to the app.</w:t>
       </w:r>
     </w:p>
     <w:p>
@@ -2839,7 +3188,25 @@
         </w:numPr>
       </w:pPr>
       <w:r>
-        <w:t xml:space="preserve">A preset change (one program change per pedal) takes about 1 ms per pedal, so a board of 8 pedals changes in under 10 ms.</w:t>
+        <w:t xml:space="preserve">Reports Switchyard sends on its own, not in answer to a request, use </w:t>
+      </w:r>
+      <w:r>
+        <w:rPr>
+          <w:rFonts w:ascii="Consolas" w:hAnsi="Consolas"/>
+        </w:rPr>
+        <w:t xml:space="preserve">qq</w:t>
+      </w:r>
+      <w:r>
+        <w:t xml:space="preserve"> = </w:t>
+      </w:r>
+      <w:r>
+        <w:rPr>
+          <w:rFonts w:ascii="Consolas" w:hAnsi="Consolas"/>
+        </w:rPr>
+        <w:t xml:space="preserve">00</w:t>
+      </w:r>
+      <w:r>
+        <w:t xml:space="preserve">.</w:t>
       </w:r>
     </w:p>
     <w:p>
@@ -2851,15 +3218,7 @@
         </w:numPr>
       </w:pPr>
       <w:r>
-        <w:t xml:space="preserve">Sending every setting individually takes about 5 ms per pedal for a pedal like Flashover, so presets are the faster way to switch songs.</w:t>
-      </w:r>
-    </w:p>
-    <w:p>
-      <w:pPr>
-        <w:pStyle w:val="Heading1"/>
-      </w:pPr>
-      <w:r>
-        <w:t xml:space="preserve">Versioning</w:t>
+        <w:t xml:space="preserve">The app waits for each answer before sending its next request to the same pedal or to Switchyard. USB is much faster than the loop’s MIDI, so this keeps Switchyard from having to store a backlog. The setlist part entries are the exception: they aren’t answered one by one (see Sending a setlist).</w:t>
       </w:r>
     </w:p>
     <w:p>
@@ -2871,7 +3230,41 @@
         </w:numPr>
       </w:pPr>
       <w:r>
-        <w:t xml:space="preserve">Every pedal reports which version of this specification it follows, in its identity reply.</w:t>
+        <w:t xml:space="preserve">If no answer arrives within 1 second, the app sends the request again with a new sequence number. After three tries it reports the problem.</w:t>
+      </w:r>
+    </w:p>
+    <w:p>
+      <w:pPr>
+        <w:pStyle w:val="Heading2"/>
+      </w:pPr>
+      <w:r>
+        <w:t xml:space="preserve">Scan loop: finding the pedals</w:t>
+      </w:r>
+    </w:p>
+    <w:p>
+      <w:pPr/>
+      <w:r>
+        <w:t xml:space="preserve">Scan loop runs the setup steps in “Setting up” above: count, identify and assign. Switchyard keeps each pedal’s existing channel unless it has none or two pedals share one, so channels stay the same from one scan to the next. A new pedal gets the lowest free channel.</w:t>
+      </w:r>
+    </w:p>
+    <w:p>
+      <w:pPr/>
+      <w:r>
+        <w:t xml:space="preserve">Switchyard scans by itself at power-up and when a broken loop is repaired. The app can ask for a scan at any time, or just ask for the result of the last one with Get pedal list.</w:t>
+      </w:r>
+    </w:p>
+    <w:p>
+      <w:pPr>
+        <w:pStyle w:val="Heading2"/>
+      </w:pPr>
+      <w:r>
+        <w:t xml:space="preserve">The setlist in Switchyard</w:t>
+      </w:r>
+    </w:p>
+    <w:p>
+      <w:pPr/>
+      <w:r>
+        <w:t xml:space="preserve">The app holds the master copy of every setlist, with the song names and everything else the player sees. Switchyard stores a compact version, just enough to work on stage without the phone:</w:t>
       </w:r>
     </w:p>
     <w:p>
@@ -2883,7 +3276,13 @@
         </w:numPr>
       </w:pPr>
       <w:r>
-        <w:t xml:space="preserve">New versions of the specification should only add things, never change the meaning of existing messages, so older pedals keep working.</w:t>
+        <w:rPr>
+          <w:b/>
+        </w:rPr>
+        <w:t xml:space="preserve">A pedal table</w:t>
+      </w:r>
+      <w:r>
+        <w:t xml:space="preserve"> of up to 32 pedals. Each entry is either a Linework pedal, named by its serial number, or another brand’s pedal, named by its MIDI channel on the other-brands MIDI out. Naming Linework pedals by serial means the setlist still works if the player re-cables the board and the channels change.</w:t>
       </w:r>
     </w:p>
     <w:p>
@@ -2895,15 +3294,13 @@
         </w:numPr>
       </w:pPr>
       <w:r>
-        <w:t xml:space="preserve">Pedals can be updated to newer versions with a firmware update.</w:t>
-      </w:r>
-    </w:p>
-    <w:p>
-      <w:pPr>
-        <w:pStyle w:val="Heading1"/>
-      </w:pPr>
-      <w:r>
-        <w:t xml:space="preserve">Open questions</w:t>
+        <w:rPr>
+          <w:b/>
+        </w:rPr>
+        <w:t xml:space="preserve">The parts,</w:t>
+      </w:r>
+      <w:r>
+        <w:t xml:space="preserve"> in playing order. Each part has its song number (1–99), its part number within the song (1–99), and a list of pedal-and-preset pairs: the pedal’s place in the pedal table and the preset slot to recall. A pedal that isn’t listed stays as it is.</w:t>
       </w:r>
     </w:p>
     <w:p>
@@ -2915,7 +3312,33 @@
         </w:numPr>
       </w:pPr>
       <w:r>
-        <w:t xml:space="preserve">Do any pedals need more than 8 knobs or 7 mode switches?</w:t>
+        <w:rPr>
+          <w:b/>
+        </w:rPr>
+        <w:t xml:space="preserve">The setlist ID,</w:t>
+      </w:r>
+      <w:r>
+        <w:t xml:space="preserve"> a number the app chooses, and the wrap setting.</w:t>
+      </w:r>
+    </w:p>
+    <w:p>
+      <w:pPr/>
+      <w:r>
+        <w:t xml:space="preserve">Limits: 99 songs and 99 parts per song, which is what the LED readout can show, and up to 4,000 parts in all. Each pedal’s presets are stored without duplicates, so the 128-preset limit is per sound, not per part (see Presets).</w:t>
+      </w:r>
+    </w:p>
+    <w:p>
+      <w:pPr/>
+      <w:r>
+        <w:t xml:space="preserve">Like firmware, Switchyard keeps two copies: a new setlist goes into the spare copy and is checked before Switchyard switches to it. If an upload fails or is interrupted, the old setlist stays.</w:t>
+      </w:r>
+    </w:p>
+    <w:p>
+      <w:pPr>
+        <w:pStyle w:val="Heading3"/>
+      </w:pPr>
+      <w:r>
+        <w:t xml:space="preserve">Stepping through parts</w:t>
       </w:r>
     </w:p>
     <w:p>
@@ -2927,7 +3350,2224 @@
         </w:numPr>
       </w:pPr>
       <w:r>
+        <w:rPr>
+          <w:b/>
+        </w:rPr>
+        <w:t xml:space="preserve">Up or Down</w:t>
+      </w:r>
+      <w:r>
+        <w:t xml:space="preserve"> moves to the next or previous part. For each pedal listed in the new part, Switchyard sends a program change: into the loop on the pedal’s current channel for a Linework pedal, or out of the other-brands MIDI out for another brand’s pedal. Then it sends a Position report to the app.</w:t>
+      </w:r>
+    </w:p>
+    <w:p>
+      <w:pPr>
+        <w:pStyle w:val="ListParagraph"/>
+        <w:numPr>
+          <w:ilvl w:val="0"/>
+          <w:numId w:val="90"/>
+        </w:numPr>
+      </w:pPr>
+      <w:r>
+        <w:t xml:space="preserve">At the end of the setlist, Up either wraps to the first part or does nothing, depending on the wrap setting. Down at the start works the same way. Either way the app gets a Position report, so it can show what happened.</w:t>
+      </w:r>
+    </w:p>
+    <w:p>
+      <w:pPr>
+        <w:pStyle w:val="ListParagraph"/>
+        <w:numPr>
+          <w:ilvl w:val="0"/>
+          <w:numId w:val="90"/>
+        </w:numPr>
+      </w:pPr>
+      <w:r>
+        <w:t xml:space="preserve">A pedal in the setlist that wasn’t found in the last scan is skipped. The app shows it as missing.</w:t>
+      </w:r>
+    </w:p>
+    <w:p>
+      <w:pPr>
+        <w:pStyle w:val="ListParagraph"/>
+        <w:numPr>
+          <w:ilvl w:val="0"/>
+          <w:numId w:val="90"/>
+        </w:numPr>
+      </w:pPr>
+      <w:r>
+        <w:rPr>
+          <w:b/>
+        </w:rPr>
+        <w:t xml:space="preserve">Power-up:</w:t>
+      </w:r>
+      <w:r>
+        <w:t xml:space="preserve"> Switchyard remembers the current part. At power-up it scans the loop, returns to that part and sends that part’s program changes, so every pedal agrees with it.</w:t>
+      </w:r>
+    </w:p>
+    <w:p>
+      <w:pPr>
+        <w:pStyle w:val="ListParagraph"/>
+        <w:numPr>
+          <w:ilvl w:val="0"/>
+          <w:numId w:val="90"/>
+        </w:numPr>
+      </w:pPr>
+      <w:r>
+        <w:rPr>
+          <w:b/>
+        </w:rPr>
+        <w:t xml:space="preserve">A new setlist:</w:t>
+      </w:r>
+      <w:r>
+        <w:t xml:space="preserve"> Switchyard stays on the same part number, or goes to the first part if that number no longer exists, and sends nothing. If the app wants the new settings applied straight away, it sends Jump.</w:t>
+      </w:r>
+    </w:p>
+    <w:p>
+      <w:pPr>
+        <w:pStyle w:val="Heading3"/>
+      </w:pPr>
+      <w:r>
+        <w:t xml:space="preserve">Sending a setlist</w:t>
+      </w:r>
+    </w:p>
+    <w:p>
+      <w:pPr/>
+      <w:r>
+        <w:t xml:space="preserve">1. The app runs Scan loop, or checks Get pedal list, so it has every pedal’s serial number and channel.</w:t>
+      </w:r>
+    </w:p>
+    <w:p>
+      <w:pPr/>
+      <w:r>
+        <w:t xml:space="preserve">2. It writes each pedal’s presets with Store preset, which goes into the loop, and can check them with Read preset.</w:t>
+      </w:r>
+    </w:p>
+    <w:p>
+      <w:pPr/>
+      <w:r>
+        <w:t xml:space="preserve">3. It sends Setlist begin, then every pedal entry and part entry, then Setlist finish.</w:t>
+      </w:r>
+    </w:p>
+    <w:p>
+      <w:pPr/>
+      <w:r>
+        <w:t xml:space="preserve">4. At Setlist finish, Switchyard checks the counts and the CRC (see “CRC-32” in the Glossary), then switches to the new setlist and acknowledges it.</w:t>
+      </w:r>
+    </w:p>
+    <w:p>
+      <w:pPr/>
+      <w:r>
+        <w:t xml:space="preserve">Pedal and part entries get no acknowledgement unless something is wrong. USB checks its own data, and the CRC at the end catches anything missed, so a typical setlist of 100–200 parts loads in well under a second. To edit a setlist, for example to save a sound adjusted by hand, the app sends the whole setlist again.</w:t>
+      </w:r>
+    </w:p>
+    <w:p>
+      <w:pPr/>
+      <w:r>
+        <w:t xml:space="preserve">To check whether Switchyard already has its copy, the app sends Setlist info and compares the setlist ID and CRC.</w:t>
+      </w:r>
+    </w:p>
+    <w:p>
+      <w:pPr>
+        <w:pStyle w:val="Heading2"/>
+      </w:pPr>
+      <w:r>
+        <w:t xml:space="preserve">Finding a break in the loop</w:t>
+      </w:r>
+    </w:p>
+    <w:p>
+      <w:pPr/>
+      <w:r>
+        <w:t xml:space="preserve">If a pedal loses power or a cable comes out, the messages stop coming back around the loop. To tell where, Switchyard and the pedals follow two rules:</w:t>
+      </w:r>
+    </w:p>
+    <w:p>
+      <w:pPr>
+        <w:pStyle w:val="ListParagraph"/>
+        <w:numPr>
+          <w:ilvl w:val="0"/>
+          <w:numId w:val="90"/>
+        </w:numPr>
+      </w:pPr>
+      <w:r>
+        <w:rPr>
+          <w:b/>
+        </w:rPr>
+        <w:t xml:space="preserve">Switchyard sends Active Sensing</w:t>
+      </w:r>
+      <w:r>
+        <w:t xml:space="preserve"> (see the Glossary) into the loop every 250 ms. Pedals pass it on like any other message. If it doesn’t come back within 1 second, the loop is broken.</w:t>
+      </w:r>
+    </w:p>
+    <w:p>
+      <w:pPr>
+        <w:pStyle w:val="ListParagraph"/>
+        <w:numPr>
+          <w:ilvl w:val="0"/>
+          <w:numId w:val="90"/>
+        </w:numPr>
+      </w:pPr>
+      <w:r>
+        <w:rPr>
+          <w:b/>
+        </w:rPr>
+        <w:t xml:space="preserve">A pedal that hears nothing at its MIDI in for 1 second</w:t>
+      </w:r>
+      <w:r>
+        <w:t xml:space="preserve"> sends a Loop break report with its position, once a second, until messages arrive again.</w:t>
+      </w:r>
+    </w:p>
+    <w:p>
+      <w:pPr/>
+      <w:r>
+        <w:t xml:space="preserve">Pedals after the break are still connected to Switchyard’s MIDI in, so their reports get through. Pedals before the break can’t be heard. So the lowest position that reports, </w:t>
+      </w:r>
+      <w:r>
+        <w:rPr>
+          <w:rFonts w:ascii="Consolas" w:hAnsi="Consolas"/>
+        </w:rPr>
+        <w:t xml:space="preserve">p</w:t>
+      </w:r>
+      <w:r>
+        <w:t xml:space="preserve">, says where to look:</w:t>
+      </w:r>
+    </w:p>
+    <w:tbl>
+      <w:tblPr>
+        <w:tblW w:w="9360" w:type="dxa"/>
+        <w:tblBorders>
+          <w:top w:val="single" w:sz="4" w:space="0" w:color="A0A0A0"/>
+          <w:left w:val="single" w:sz="4" w:space="0" w:color="A0A0A0"/>
+          <w:bottom w:val="single" w:sz="4" w:space="0" w:color="A0A0A0"/>
+          <w:right w:val="single" w:sz="4" w:space="0" w:color="A0A0A0"/>
+          <w:insideH w:val="single" w:sz="4" w:space="0" w:color="A0A0A0"/>
+          <w:insideV w:val="single" w:sz="4" w:space="0" w:color="A0A0A0"/>
+        </w:tblBorders>
+        <w:tblLayout w:type="fixed"/>
+        <w:tblCellMar>
+          <w:top w:w="40" w:type="dxa"/>
+          <w:left w:w="100" w:type="dxa"/>
+          <w:bottom w:w="40" w:type="dxa"/>
+          <w:right w:w="100" w:type="dxa"/>
+        </w:tblCellMar>
+      </w:tblPr>
+      <w:tblGrid>
+        <w:gridCol w:w="3400"/>
+        <w:gridCol w:w="5960"/>
+      </w:tblGrid>
+      <w:tr>
+        <w:trPr>
+          <w:cantSplit/>
+          <w:tblHeader/>
+        </w:trPr>
+        <w:tc>
+          <w:tcPr>
+            <w:tcW w:w="3400" w:type="dxa"/>
+            <w:shd w:val="clear" w:color="auto" w:fill="E7E6E6"/>
+          </w:tcPr>
+          <w:p>
+            <w:pPr>
+              <w:spacing w:before="0" w:after="0"/>
+            </w:pPr>
+            <w:r>
+              <w:rPr>
+                <w:b/>
+              </w:rPr>
+              <w:t xml:space="preserve">Reports received</w:t>
+            </w:r>
+          </w:p>
+        </w:tc>
+        <w:tc>
+          <w:tcPr>
+            <w:tcW w:w="5960" w:type="dxa"/>
+            <w:shd w:val="clear" w:color="auto" w:fill="E7E6E6"/>
+          </w:tcPr>
+          <w:p>
+            <w:pPr>
+              <w:spacing w:before="0" w:after="0"/>
+            </w:pPr>
+            <w:r>
+              <w:rPr>
+                <w:b/>
+              </w:rPr>
+              <w:t xml:space="preserve">Where to look</w:t>
+            </w:r>
+          </w:p>
+        </w:tc>
+      </w:tr>
+      <w:tr>
+        <w:trPr>
+          <w:cantSplit/>
+        </w:trPr>
+        <w:tc>
+          <w:tcPr>
+            <w:tcW w:w="3400" w:type="dxa"/>
+          </w:tcPr>
+          <w:p>
+            <w:pPr>
+              <w:spacing w:before="0" w:after="0"/>
+            </w:pPr>
+            <w:r>
+              <w:t xml:space="preserve">From position 1 and up</w:t>
+            </w:r>
+          </w:p>
+        </w:tc>
+        <w:tc>
+          <w:tcPr>
+            <w:tcW w:w="5960" w:type="dxa"/>
+          </w:tcPr>
+          <w:p>
+            <w:pPr>
+              <w:spacing w:before="0" w:after="0"/>
+            </w:pPr>
+            <w:r>
+              <w:t xml:space="preserve">The cable from Switchyard’s MIDI out to the first pedal</w:t>
+            </w:r>
+          </w:p>
+        </w:tc>
+      </w:tr>
+      <w:tr>
+        <w:trPr>
+          <w:cantSplit/>
+        </w:trPr>
+        <w:tc>
+          <w:tcPr>
+            <w:tcW w:w="3400" w:type="dxa"/>
+          </w:tcPr>
+          <w:p>
+            <w:pPr>
+              <w:spacing w:before="0" w:after="0"/>
+            </w:pPr>
+            <w:r>
+              <w:t xml:space="preserve">Lowest position </w:t>
+            </w:r>
+            <w:r>
+              <w:rPr>
+                <w:rFonts w:ascii="Consolas" w:hAnsi="Consolas"/>
+              </w:rPr>
+              <w:t xml:space="preserve">p</w:t>
+            </w:r>
+            <w:r>
+              <w:t xml:space="preserve"> is 2 or more</w:t>
+            </w:r>
+          </w:p>
+        </w:tc>
+        <w:tc>
+          <w:tcPr>
+            <w:tcW w:w="5960" w:type="dxa"/>
+          </w:tcPr>
+          <w:p>
+            <w:pPr>
+              <w:spacing w:before="0" w:after="0"/>
+            </w:pPr>
+            <w:r>
+              <w:t xml:space="preserve">Pedal </w:t>
+            </w:r>
+            <w:r>
+              <w:rPr>
+                <w:rFonts w:ascii="Consolas" w:hAnsi="Consolas"/>
+              </w:rPr>
+              <w:t xml:space="preserve">p</w:t>
+            </w:r>
+            <w:r>
+              <w:t xml:space="preserve"> − 1, or the cables either side of it</w:t>
+            </w:r>
+          </w:p>
+        </w:tc>
+      </w:tr>
+      <w:tr>
+        <w:trPr>
+          <w:cantSplit/>
+        </w:trPr>
+        <w:tc>
+          <w:tcPr>
+            <w:tcW w:w="3400" w:type="dxa"/>
+          </w:tcPr>
+          <w:p>
+            <w:pPr>
+              <w:spacing w:before="0" w:after="0"/>
+            </w:pPr>
+            <w:r>
+              <w:t xml:space="preserve">None</w:t>
+            </w:r>
+          </w:p>
+        </w:tc>
+        <w:tc>
+          <w:tcPr>
+            <w:tcW w:w="5960" w:type="dxa"/>
+          </w:tcPr>
+          <w:p>
+            <w:pPr>
+              <w:spacing w:before="0" w:after="0"/>
+            </w:pPr>
+            <w:r>
+              <w:t xml:space="preserve">The last pedal, or the cable back into Switchyard’s MIDI in</w:t>
+            </w:r>
+          </w:p>
+        </w:tc>
+      </w:tr>
+    </w:tbl>
+    <w:p>
+      <w:pPr/>
+    </w:p>
+    <w:p>
+      <w:pPr/>
+      <w:r>
+        <w:t xml:space="preserve">Switchyard sends Loop status to the app when the loop breaks and when it’s repaired, and scans again by itself once it’s repaired.</w:t>
+      </w:r>
+    </w:p>
+    <w:p>
+      <w:pPr>
+        <w:pStyle w:val="Heading2"/>
+      </w:pPr>
+      <w:r>
+        <w:t xml:space="preserve">Switchyard byte layouts</w:t>
+      </w:r>
+    </w:p>
+    <w:p>
+      <w:pPr/>
+      <w:r>
+        <w:t xml:space="preserve">The two-byte numbers </w:t>
+      </w:r>
+      <w:r>
+        <w:rPr>
+          <w:rFonts w:ascii="Consolas" w:hAnsi="Consolas"/>
+        </w:rPr>
+        <w:t xml:space="preserve">n0 n1</w:t>
+      </w:r>
+      <w:r>
+        <w:t xml:space="preserve"> (part numbers and counts) are explained under “Two-byte numbers” in the Glossary. The setlist ID </w:t>
+      </w:r>
+      <w:r>
+        <w:rPr>
+          <w:rFonts w:ascii="Consolas" w:hAnsi="Consolas"/>
+        </w:rPr>
+        <w:t xml:space="preserve">i0</w:t>
+      </w:r>
+      <w:r>
+        <w:t xml:space="preserve">…</w:t>
+      </w:r>
+      <w:r>
+        <w:rPr>
+          <w:rFonts w:ascii="Consolas" w:hAnsi="Consolas"/>
+        </w:rPr>
+        <w:t xml:space="preserve">i4</w:t>
+      </w:r>
+      <w:r>
+        <w:t xml:space="preserve"> and CRC </w:t>
+      </w:r>
+      <w:r>
+        <w:rPr>
+          <w:rFonts w:ascii="Consolas" w:hAnsi="Consolas"/>
+        </w:rPr>
+        <w:t xml:space="preserve">c0</w:t>
+      </w:r>
+      <w:r>
+        <w:t xml:space="preserve">…</w:t>
+      </w:r>
+      <w:r>
+        <w:rPr>
+          <w:rFonts w:ascii="Consolas" w:hAnsi="Consolas"/>
+        </w:rPr>
+        <w:t xml:space="preserve">c4</w:t>
+      </w:r>
+      <w:r>
+        <w:t xml:space="preserve"> are 32-bit numbers split into five 7-bit bytes, like the firmware CRC.</w:t>
+      </w:r>
+    </w:p>
+    <w:p>
+      <w:pPr>
+        <w:pStyle w:val="Heading3"/>
+      </w:pPr>
+      <w:r>
+        <w:t xml:space="preserve">Switchyard and the loop</w:t>
+      </w:r>
+    </w:p>
+    <w:tbl>
+      <w:tblPr>
+        <w:tblW w:w="9360" w:type="dxa"/>
+        <w:tblBorders>
+          <w:top w:val="single" w:sz="4" w:space="0" w:color="A0A0A0"/>
+          <w:left w:val="single" w:sz="4" w:space="0" w:color="A0A0A0"/>
+          <w:bottom w:val="single" w:sz="4" w:space="0" w:color="A0A0A0"/>
+          <w:right w:val="single" w:sz="4" w:space="0" w:color="A0A0A0"/>
+          <w:insideH w:val="single" w:sz="4" w:space="0" w:color="A0A0A0"/>
+          <w:insideV w:val="single" w:sz="4" w:space="0" w:color="A0A0A0"/>
+        </w:tblBorders>
+        <w:tblLayout w:type="fixed"/>
+        <w:tblCellMar>
+          <w:top w:w="40" w:type="dxa"/>
+          <w:left w:w="100" w:type="dxa"/>
+          <w:bottom w:w="40" w:type="dxa"/>
+          <w:right w:w="100" w:type="dxa"/>
+        </w:tblCellMar>
+      </w:tblPr>
+      <w:tblGrid>
+        <w:gridCol w:w="2000"/>
+        <w:gridCol w:w="3900"/>
+        <w:gridCol w:w="3460"/>
+      </w:tblGrid>
+      <w:tr>
+        <w:trPr>
+          <w:cantSplit/>
+          <w:tblHeader/>
+        </w:trPr>
+        <w:tc>
+          <w:tcPr>
+            <w:tcW w:w="2000" w:type="dxa"/>
+            <w:shd w:val="clear" w:color="auto" w:fill="E7E6E6"/>
+          </w:tcPr>
+          <w:p>
+            <w:pPr>
+              <w:spacing w:before="0" w:after="0"/>
+            </w:pPr>
+            <w:r>
+              <w:rPr>
+                <w:b/>
+              </w:rPr>
+              <w:t xml:space="preserve">Message</w:t>
+            </w:r>
+          </w:p>
+        </w:tc>
+        <w:tc>
+          <w:tcPr>
+            <w:tcW w:w="3900" w:type="dxa"/>
+            <w:shd w:val="clear" w:color="auto" w:fill="E7E6E6"/>
+          </w:tcPr>
+          <w:p>
+            <w:pPr>
+              <w:spacing w:before="0" w:after="0"/>
+            </w:pPr>
+            <w:r>
+              <w:rPr>
+                <w:b/>
+              </w:rPr>
+              <w:t xml:space="preserve">Bytes the app sends</w:t>
+            </w:r>
+          </w:p>
+        </w:tc>
+        <w:tc>
+          <w:tcPr>
+            <w:tcW w:w="3460" w:type="dxa"/>
+            <w:shd w:val="clear" w:color="auto" w:fill="E7E6E6"/>
+          </w:tcPr>
+          <w:p>
+            <w:pPr>
+              <w:spacing w:before="0" w:after="0"/>
+            </w:pPr>
+            <w:r>
+              <w:rPr>
+                <w:b/>
+              </w:rPr>
+              <w:t xml:space="preserve">Switchyard’s answer</w:t>
+            </w:r>
+          </w:p>
+        </w:tc>
+      </w:tr>
+      <w:tr>
+        <w:trPr>
+          <w:cantSplit/>
+        </w:trPr>
+        <w:tc>
+          <w:tcPr>
+            <w:tcW w:w="2000" w:type="dxa"/>
+          </w:tcPr>
+          <w:p>
+            <w:pPr>
+              <w:spacing w:before="0" w:after="0"/>
+            </w:pPr>
+            <w:r>
+              <w:t xml:space="preserve">Switchyard info</w:t>
+            </w:r>
+          </w:p>
+        </w:tc>
+        <w:tc>
+          <w:tcPr>
+            <w:tcW w:w="3900" w:type="dxa"/>
+          </w:tcPr>
+          <w:p>
+            <w:pPr>
+              <w:spacing w:before="0" w:after="0"/>
+            </w:pPr>
+            <w:r>
+              <w:rPr>
+                <w:rFonts w:ascii="Consolas" w:hAnsi="Consolas"/>
+              </w:rPr>
+              <w:t xml:space="preserve">F0 7D 4C 57 40 qq F7</w:t>
+            </w:r>
+          </w:p>
+        </w:tc>
+        <w:tc>
+          <w:tcPr>
+            <w:tcW w:w="3460" w:type="dxa"/>
+          </w:tcPr>
+          <w:p>
+            <w:pPr>
+              <w:spacing w:before="0" w:after="0"/>
+            </w:pPr>
+            <w:r>
+              <w:rPr>
+                <w:rFonts w:ascii="Consolas" w:hAnsi="Consolas"/>
+              </w:rPr>
+              <w:t xml:space="preserve">F0 7D 4C 57 41 qq aa bb cc ss s0…s9 pw F7</w:t>
+            </w:r>
+            <w:r>
+              <w:t xml:space="preserve">: firmware version, specification version, Switchyard’s serial, and power: </w:t>
+            </w:r>
+            <w:r>
+              <w:rPr>
+                <w:rFonts w:ascii="Consolas" w:hAnsi="Consolas"/>
+              </w:rPr>
+              <w:t xml:space="preserve">pw</w:t>
+            </w:r>
+            <w:r>
+              <w:t xml:space="preserve"> bit 0 = 9V connected, bit 1 = charging the phone</w:t>
+            </w:r>
+          </w:p>
+        </w:tc>
+      </w:tr>
+      <w:tr>
+        <w:trPr>
+          <w:cantSplit/>
+        </w:trPr>
+        <w:tc>
+          <w:tcPr>
+            <w:tcW w:w="2000" w:type="dxa"/>
+          </w:tcPr>
+          <w:p>
+            <w:pPr>
+              <w:spacing w:before="0" w:after="0"/>
+            </w:pPr>
+            <w:r>
+              <w:t xml:space="preserve">Scan loop</w:t>
+            </w:r>
+          </w:p>
+        </w:tc>
+        <w:tc>
+          <w:tcPr>
+            <w:tcW w:w="3900" w:type="dxa"/>
+          </w:tcPr>
+          <w:p>
+            <w:pPr>
+              <w:spacing w:before="0" w:after="0"/>
+            </w:pPr>
+            <w:r>
+              <w:rPr>
+                <w:rFonts w:ascii="Consolas" w:hAnsi="Consolas"/>
+              </w:rPr>
+              <w:t xml:space="preserve">F0 7D 4C 57 42 qq F7</w:t>
+            </w:r>
+          </w:p>
+        </w:tc>
+        <w:tc>
+          <w:tcPr>
+            <w:tcW w:w="3460" w:type="dxa"/>
+          </w:tcPr>
+          <w:p>
+            <w:pPr>
+              <w:spacing w:before="0" w:after="0"/>
+            </w:pPr>
+            <w:r>
+              <w:t xml:space="preserve">Runs the scan, then answers like Get pedal list</w:t>
+            </w:r>
+          </w:p>
+        </w:tc>
+      </w:tr>
+      <w:tr>
+        <w:trPr>
+          <w:cantSplit/>
+        </w:trPr>
+        <w:tc>
+          <w:tcPr>
+            <w:tcW w:w="2000" w:type="dxa"/>
+          </w:tcPr>
+          <w:p>
+            <w:pPr>
+              <w:spacing w:before="0" w:after="0"/>
+            </w:pPr>
+            <w:r>
+              <w:t xml:space="preserve">Get pedal list</w:t>
+            </w:r>
+          </w:p>
+        </w:tc>
+        <w:tc>
+          <w:tcPr>
+            <w:tcW w:w="3900" w:type="dxa"/>
+          </w:tcPr>
+          <w:p>
+            <w:pPr>
+              <w:spacing w:before="0" w:after="0"/>
+            </w:pPr>
+            <w:r>
+              <w:rPr>
+                <w:rFonts w:ascii="Consolas" w:hAnsi="Consolas"/>
+              </w:rPr>
+              <w:t xml:space="preserve">F0 7D 4C 57 44 qq F7</w:t>
+            </w:r>
+          </w:p>
+        </w:tc>
+        <w:tc>
+          <w:tcPr>
+            <w:tcW w:w="3460" w:type="dxa"/>
+          </w:tcPr>
+          <w:p>
+            <w:pPr>
+              <w:spacing w:before="0" w:after="0"/>
+            </w:pPr>
+            <w:r>
+              <w:rPr>
+                <w:rFonts w:ascii="Consolas" w:hAnsi="Consolas"/>
+              </w:rPr>
+              <w:t xml:space="preserve">F0 7D 4C 57 45 qq nn F7</w:t>
+            </w:r>
+            <w:r>
+              <w:t xml:space="preserve"> with the number of pedals, then one </w:t>
+            </w:r>
+            <w:r>
+              <w:rPr>
+                <w:rFonts w:ascii="Consolas" w:hAnsi="Consolas"/>
+              </w:rPr>
+              <w:t xml:space="preserve">F0 7D 4C 57 46 qq pp dd m0 m1 aa bb cc ss s0…s9 F7</w:t>
+            </w:r>
+            <w:r>
+              <w:t xml:space="preserve"> per pedal, in loop order</w:t>
+            </w:r>
+          </w:p>
+        </w:tc>
+      </w:tr>
+      <w:tr>
+        <w:trPr>
+          <w:cantSplit/>
+        </w:trPr>
+        <w:tc>
+          <w:tcPr>
+            <w:tcW w:w="2000" w:type="dxa"/>
+          </w:tcPr>
+          <w:p>
+            <w:pPr>
+              <w:spacing w:before="0" w:after="0"/>
+            </w:pPr>
+            <w:r>
+              <w:t xml:space="preserve">Loop status</w:t>
+            </w:r>
+          </w:p>
+        </w:tc>
+        <w:tc>
+          <w:tcPr>
+            <w:tcW w:w="3900" w:type="dxa"/>
+          </w:tcPr>
+          <w:p>
+            <w:pPr>
+              <w:spacing w:before="0" w:after="0"/>
+            </w:pPr>
+            <w:r>
+              <w:rPr>
+                <w:rFonts w:ascii="Consolas" w:hAnsi="Consolas"/>
+              </w:rPr>
+              <w:t xml:space="preserve">F0 7D 4C 57 48 qq F7</w:t>
+            </w:r>
+          </w:p>
+        </w:tc>
+        <w:tc>
+          <w:tcPr>
+            <w:tcW w:w="3460" w:type="dxa"/>
+          </w:tcPr>
+          <w:p>
+            <w:pPr>
+              <w:spacing w:before="0" w:after="0"/>
+            </w:pPr>
+            <w:r>
+              <w:rPr>
+                <w:rFonts w:ascii="Consolas" w:hAnsi="Consolas"/>
+              </w:rPr>
+              <w:t xml:space="preserve">F0 7D 4C 57 49 qq st nn bb F7</w:t>
+            </w:r>
+            <w:r>
+              <w:t xml:space="preserve">. </w:t>
+            </w:r>
+            <w:r>
+              <w:rPr>
+                <w:rFonts w:ascii="Consolas" w:hAnsi="Consolas"/>
+              </w:rPr>
+              <w:t xml:space="preserve">st</w:t>
+            </w:r>
+            <w:r>
+              <w:t xml:space="preserve">: </w:t>
+            </w:r>
+            <w:r>
+              <w:rPr>
+                <w:rFonts w:ascii="Consolas" w:hAnsi="Consolas"/>
+              </w:rPr>
+              <w:t xml:space="preserve">00</w:t>
+            </w:r>
+            <w:r>
+              <w:t xml:space="preserve"> working, </w:t>
+            </w:r>
+            <w:r>
+              <w:rPr>
+                <w:rFonts w:ascii="Consolas" w:hAnsi="Consolas"/>
+              </w:rPr>
+              <w:t xml:space="preserve">01</w:t>
+            </w:r>
+            <w:r>
+              <w:t xml:space="preserve"> broken. </w:t>
+            </w:r>
+            <w:r>
+              <w:rPr>
+                <w:rFonts w:ascii="Consolas" w:hAnsi="Consolas"/>
+              </w:rPr>
+              <w:t xml:space="preserve">nn</w:t>
+            </w:r>
+            <w:r>
+              <w:t xml:space="preserve">: pedals in the last scan. </w:t>
+            </w:r>
+            <w:r>
+              <w:rPr>
+                <w:rFonts w:ascii="Consolas" w:hAnsi="Consolas"/>
+              </w:rPr>
+              <w:t xml:space="preserve">bb</w:t>
+            </w:r>
+            <w:r>
+              <w:t xml:space="preserve">: where to look, </w:t>
+            </w:r>
+            <w:r>
+              <w:rPr>
+                <w:rFonts w:ascii="Consolas" w:hAnsi="Consolas"/>
+              </w:rPr>
+              <w:t xml:space="preserve">00</w:t>
+            </w:r>
+            <w:r>
+              <w:t xml:space="preserve"> Switchyard’s MIDI out cable, </w:t>
+            </w:r>
+            <w:r>
+              <w:rPr>
+                <w:rFonts w:ascii="Consolas" w:hAnsi="Consolas"/>
+              </w:rPr>
+              <w:t xml:space="preserve">01</w:t>
+            </w:r>
+            <w:r>
+              <w:t xml:space="preserve">–</w:t>
+            </w:r>
+            <w:r>
+              <w:rPr>
+                <w:rFonts w:ascii="Consolas" w:hAnsi="Consolas"/>
+              </w:rPr>
+              <w:t xml:space="preserve">10</w:t>
+            </w:r>
+            <w:r>
+              <w:t xml:space="preserve"> a pedal position, </w:t>
+            </w:r>
+            <w:r>
+              <w:rPr>
+                <w:rFonts w:ascii="Consolas" w:hAnsi="Consolas"/>
+              </w:rPr>
+              <w:t xml:space="preserve">7F</w:t>
+            </w:r>
+            <w:r>
+              <w:t xml:space="preserve"> the last pedal or the cable back. Also sent by itself when the loop breaks or is repaired</w:t>
+            </w:r>
+          </w:p>
+        </w:tc>
+      </w:tr>
+      <w:tr>
+        <w:trPr>
+          <w:cantSplit/>
+        </w:trPr>
+        <w:tc>
+          <w:tcPr>
+            <w:tcW w:w="2000" w:type="dxa"/>
+          </w:tcPr>
+          <w:p>
+            <w:pPr>
+              <w:spacing w:before="0" w:after="0"/>
+            </w:pPr>
+            <w:r>
+              <w:t xml:space="preserve">Send to other brands</w:t>
+            </w:r>
+          </w:p>
+        </w:tc>
+        <w:tc>
+          <w:tcPr>
+            <w:tcW w:w="3900" w:type="dxa"/>
+          </w:tcPr>
+          <w:p>
+            <w:pPr>
+              <w:spacing w:before="0" w:after="0"/>
+            </w:pPr>
+            <w:r>
+              <w:rPr>
+                <w:rFonts w:ascii="Consolas" w:hAnsi="Consolas"/>
+              </w:rPr>
+              <w:t xml:space="preserve">F0 7D 4C 57 4A qq kk ch v1 v2 F7</w:t>
+            </w:r>
+            <w:r>
+              <w:t xml:space="preserve">. </w:t>
+            </w:r>
+            <w:r>
+              <w:rPr>
+                <w:rFonts w:ascii="Consolas" w:hAnsi="Consolas"/>
+              </w:rPr>
+              <w:t xml:space="preserve">kk</w:t>
+            </w:r>
+            <w:r>
+              <w:t xml:space="preserve"> </w:t>
+            </w:r>
+            <w:r>
+              <w:rPr>
+                <w:rFonts w:ascii="Consolas" w:hAnsi="Consolas"/>
+              </w:rPr>
+              <w:t xml:space="preserve">00</w:t>
+            </w:r>
+            <w:r>
+              <w:t xml:space="preserve">: program change </w:t>
+            </w:r>
+            <w:r>
+              <w:rPr>
+                <w:rFonts w:ascii="Consolas" w:hAnsi="Consolas"/>
+              </w:rPr>
+              <w:t xml:space="preserve">v1</w:t>
+            </w:r>
+            <w:r>
+              <w:t xml:space="preserve"> (</w:t>
+            </w:r>
+            <w:r>
+              <w:rPr>
+                <w:rFonts w:ascii="Consolas" w:hAnsi="Consolas"/>
+              </w:rPr>
+              <w:t xml:space="preserve">v2</w:t>
+            </w:r>
+            <w:r>
+              <w:t xml:space="preserve"> = </w:t>
+            </w:r>
+            <w:r>
+              <w:rPr>
+                <w:rFonts w:ascii="Consolas" w:hAnsi="Consolas"/>
+              </w:rPr>
+              <w:t xml:space="preserve">00</w:t>
+            </w:r>
+            <w:r>
+              <w:t xml:space="preserve">). </w:t>
+            </w:r>
+            <w:r>
+              <w:rPr>
+                <w:rFonts w:ascii="Consolas" w:hAnsi="Consolas"/>
+              </w:rPr>
+              <w:t xml:space="preserve">kk</w:t>
+            </w:r>
+            <w:r>
+              <w:t xml:space="preserve"> </w:t>
+            </w:r>
+            <w:r>
+              <w:rPr>
+                <w:rFonts w:ascii="Consolas" w:hAnsi="Consolas"/>
+              </w:rPr>
+              <w:t xml:space="preserve">01</w:t>
+            </w:r>
+            <w:r>
+              <w:t xml:space="preserve">: control change number </w:t>
+            </w:r>
+            <w:r>
+              <w:rPr>
+                <w:rFonts w:ascii="Consolas" w:hAnsi="Consolas"/>
+              </w:rPr>
+              <w:t xml:space="preserve">v1</w:t>
+            </w:r>
+            <w:r>
+              <w:t xml:space="preserve">, value </w:t>
+            </w:r>
+            <w:r>
+              <w:rPr>
+                <w:rFonts w:ascii="Consolas" w:hAnsi="Consolas"/>
+              </w:rPr>
+              <w:t xml:space="preserve">v2</w:t>
+            </w:r>
+          </w:p>
+        </w:tc>
+        <w:tc>
+          <w:tcPr>
+            <w:tcW w:w="3460" w:type="dxa"/>
+          </w:tcPr>
+          <w:p>
+            <w:pPr>
+              <w:spacing w:before="0" w:after="0"/>
+            </w:pPr>
+            <w:r>
+              <w:t xml:space="preserve">Sends that message out of the other-brands MIDI out on channel </w:t>
+            </w:r>
+            <w:r>
+              <w:rPr>
+                <w:rFonts w:ascii="Consolas" w:hAnsi="Consolas"/>
+              </w:rPr>
+              <w:t xml:space="preserve">ch</w:t>
+            </w:r>
+            <w:r>
+              <w:t xml:space="preserve">. Acknowledgement</w:t>
+            </w:r>
+          </w:p>
+        </w:tc>
+      </w:tr>
+    </w:tbl>
+    <w:p>
+      <w:pPr/>
+    </w:p>
+    <w:p>
+      <w:pPr/>
+      <w:r>
+        <w:t xml:space="preserve">In the pedal list, </w:t>
+      </w:r>
+      <w:r>
+        <w:rPr>
+          <w:rFonts w:ascii="Consolas" w:hAnsi="Consolas"/>
+        </w:rPr>
+        <w:t xml:space="preserve">pp</w:t>
+      </w:r>
+      <w:r>
+        <w:t xml:space="preserve">, </w:t>
+      </w:r>
+      <w:r>
+        <w:rPr>
+          <w:rFonts w:ascii="Consolas" w:hAnsi="Consolas"/>
+        </w:rPr>
+        <w:t xml:space="preserve">dd</w:t>
+      </w:r>
+      <w:r>
+        <w:t xml:space="preserve">, </w:t>
+      </w:r>
+      <w:r>
+        <w:rPr>
+          <w:rFonts w:ascii="Consolas" w:hAnsi="Consolas"/>
+        </w:rPr>
+        <w:t xml:space="preserve">m0 m1</w:t>
+      </w:r>
+      <w:r>
+        <w:t xml:space="preserve">, </w:t>
+      </w:r>
+      <w:r>
+        <w:rPr>
+          <w:rFonts w:ascii="Consolas" w:hAnsi="Consolas"/>
+        </w:rPr>
+        <w:t xml:space="preserve">aa bb cc</w:t>
+      </w:r>
+      <w:r>
+        <w:t xml:space="preserve"> and </w:t>
+      </w:r>
+      <w:r>
+        <w:rPr>
+          <w:rFonts w:ascii="Consolas" w:hAnsi="Consolas"/>
+        </w:rPr>
+        <w:t xml:space="preserve">ss</w:t>
+      </w:r>
+      <w:r>
+        <w:t xml:space="preserve"> mean the same as in a pedal’s identity reply.</w:t>
+      </w:r>
+    </w:p>
+    <w:p>
+      <w:pPr>
+        <w:pStyle w:val="Heading3"/>
+      </w:pPr>
+      <w:r>
+        <w:t xml:space="preserve">Setlists</w:t>
+      </w:r>
+    </w:p>
+    <w:tbl>
+      <w:tblPr>
+        <w:tblW w:w="9360" w:type="dxa"/>
+        <w:tblBorders>
+          <w:top w:val="single" w:sz="4" w:space="0" w:color="A0A0A0"/>
+          <w:left w:val="single" w:sz="4" w:space="0" w:color="A0A0A0"/>
+          <w:bottom w:val="single" w:sz="4" w:space="0" w:color="A0A0A0"/>
+          <w:right w:val="single" w:sz="4" w:space="0" w:color="A0A0A0"/>
+          <w:insideH w:val="single" w:sz="4" w:space="0" w:color="A0A0A0"/>
+          <w:insideV w:val="single" w:sz="4" w:space="0" w:color="A0A0A0"/>
+        </w:tblBorders>
+        <w:tblLayout w:type="fixed"/>
+        <w:tblCellMar>
+          <w:top w:w="40" w:type="dxa"/>
+          <w:left w:w="100" w:type="dxa"/>
+          <w:bottom w:w="40" w:type="dxa"/>
+          <w:right w:w="100" w:type="dxa"/>
+        </w:tblCellMar>
+      </w:tblPr>
+      <w:tblGrid>
+        <w:gridCol w:w="2000"/>
+        <w:gridCol w:w="3900"/>
+        <w:gridCol w:w="3460"/>
+      </w:tblGrid>
+      <w:tr>
+        <w:trPr>
+          <w:cantSplit/>
+          <w:tblHeader/>
+        </w:trPr>
+        <w:tc>
+          <w:tcPr>
+            <w:tcW w:w="2000" w:type="dxa"/>
+            <w:shd w:val="clear" w:color="auto" w:fill="E7E6E6"/>
+          </w:tcPr>
+          <w:p>
+            <w:pPr>
+              <w:spacing w:before="0" w:after="0"/>
+            </w:pPr>
+            <w:r>
+              <w:rPr>
+                <w:b/>
+              </w:rPr>
+              <w:t xml:space="preserve">Message</w:t>
+            </w:r>
+          </w:p>
+        </w:tc>
+        <w:tc>
+          <w:tcPr>
+            <w:tcW w:w="3900" w:type="dxa"/>
+            <w:shd w:val="clear" w:color="auto" w:fill="E7E6E6"/>
+          </w:tcPr>
+          <w:p>
+            <w:pPr>
+              <w:spacing w:before="0" w:after="0"/>
+            </w:pPr>
+            <w:r>
+              <w:rPr>
+                <w:b/>
+              </w:rPr>
+              <w:t xml:space="preserve">Bytes the app sends</w:t>
+            </w:r>
+          </w:p>
+        </w:tc>
+        <w:tc>
+          <w:tcPr>
+            <w:tcW w:w="3460" w:type="dxa"/>
+            <w:shd w:val="clear" w:color="auto" w:fill="E7E6E6"/>
+          </w:tcPr>
+          <w:p>
+            <w:pPr>
+              <w:spacing w:before="0" w:after="0"/>
+            </w:pPr>
+            <w:r>
+              <w:rPr>
+                <w:b/>
+              </w:rPr>
+              <w:t xml:space="preserve">Switchyard’s answer</w:t>
+            </w:r>
+          </w:p>
+        </w:tc>
+      </w:tr>
+      <w:tr>
+        <w:trPr>
+          <w:cantSplit/>
+        </w:trPr>
+        <w:tc>
+          <w:tcPr>
+            <w:tcW w:w="2000" w:type="dxa"/>
+          </w:tcPr>
+          <w:p>
+            <w:pPr>
+              <w:spacing w:before="0" w:after="0"/>
+            </w:pPr>
+            <w:r>
+              <w:t xml:space="preserve">Setlist begin</w:t>
+            </w:r>
+          </w:p>
+        </w:tc>
+        <w:tc>
+          <w:tcPr>
+            <w:tcW w:w="3900" w:type="dxa"/>
+          </w:tcPr>
+          <w:p>
+            <w:pPr>
+              <w:spacing w:before="0" w:after="0"/>
+            </w:pPr>
+            <w:r>
+              <w:rPr>
+                <w:rFonts w:ascii="Consolas" w:hAnsi="Consolas"/>
+              </w:rPr>
+              <w:t xml:space="preserve">F0 7D 4C 57 50 qq i0…i4 ff np n0 n1 F7</w:t>
+            </w:r>
+            <w:r>
+              <w:t xml:space="preserve">. </w:t>
+            </w:r>
+            <w:r>
+              <w:rPr>
+                <w:rFonts w:ascii="Consolas" w:hAnsi="Consolas"/>
+              </w:rPr>
+              <w:t xml:space="preserve">ff</w:t>
+            </w:r>
+            <w:r>
+              <w:t xml:space="preserve"> bit 0 = wrap around. </w:t>
+            </w:r>
+            <w:r>
+              <w:rPr>
+                <w:rFonts w:ascii="Consolas" w:hAnsi="Consolas"/>
+              </w:rPr>
+              <w:t xml:space="preserve">np</w:t>
+            </w:r>
+            <w:r>
+              <w:t xml:space="preserve">: pedals in the table (</w:t>
+            </w:r>
+            <w:r>
+              <w:rPr>
+                <w:rFonts w:ascii="Consolas" w:hAnsi="Consolas"/>
+              </w:rPr>
+              <w:t xml:space="preserve">01</w:t>
+            </w:r>
+            <w:r>
+              <w:t xml:space="preserve">–</w:t>
+            </w:r>
+            <w:r>
+              <w:rPr>
+                <w:rFonts w:ascii="Consolas" w:hAnsi="Consolas"/>
+              </w:rPr>
+              <w:t xml:space="preserve">20</w:t>
+            </w:r>
+            <w:r>
+              <w:t xml:space="preserve">). </w:t>
+            </w:r>
+            <w:r>
+              <w:rPr>
+                <w:rFonts w:ascii="Consolas" w:hAnsi="Consolas"/>
+              </w:rPr>
+              <w:t xml:space="preserve">n0 n1</w:t>
+            </w:r>
+            <w:r>
+              <w:t xml:space="preserve">: number of parts</w:t>
+            </w:r>
+          </w:p>
+        </w:tc>
+        <w:tc>
+          <w:tcPr>
+            <w:tcW w:w="3460" w:type="dxa"/>
+          </w:tcPr>
+          <w:p>
+            <w:pPr>
+              <w:spacing w:before="0" w:after="0"/>
+            </w:pPr>
+            <w:r>
+              <w:t xml:space="preserve">Erases the spare copy. Acknowledgement once it’s ready</w:t>
+            </w:r>
+          </w:p>
+        </w:tc>
+      </w:tr>
+      <w:tr>
+        <w:trPr>
+          <w:cantSplit/>
+        </w:trPr>
+        <w:tc>
+          <w:tcPr>
+            <w:tcW w:w="2000" w:type="dxa"/>
+          </w:tcPr>
+          <w:p>
+            <w:pPr>
+              <w:spacing w:before="0" w:after="0"/>
+            </w:pPr>
+            <w:r>
+              <w:t xml:space="preserve">Pedal entry</w:t>
+            </w:r>
+          </w:p>
+        </w:tc>
+        <w:tc>
+          <w:tcPr>
+            <w:tcW w:w="3900" w:type="dxa"/>
+          </w:tcPr>
+          <w:p>
+            <w:pPr>
+              <w:spacing w:before="0" w:after="0"/>
+            </w:pPr>
+            <w:r>
+              <w:t xml:space="preserve">Linework: </w:t>
+            </w:r>
+            <w:r>
+              <w:rPr>
+                <w:rFonts w:ascii="Consolas" w:hAnsi="Consolas"/>
+              </w:rPr>
+              <w:t xml:space="preserve">F0 7D 4C 57 51 qq ix 00 s0…s9 F7</w:t>
+            </w:r>
+            <w:r>
+              <w:t xml:space="preserve">. Other brand: </w:t>
+            </w:r>
+            <w:r>
+              <w:rPr>
+                <w:rFonts w:ascii="Consolas" w:hAnsi="Consolas"/>
+              </w:rPr>
+              <w:t xml:space="preserve">F0 7D 4C 57 51 qq ix 01 ch F7</w:t>
+            </w:r>
+            <w:r>
+              <w:t xml:space="preserve">. </w:t>
+            </w:r>
+            <w:r>
+              <w:rPr>
+                <w:rFonts w:ascii="Consolas" w:hAnsi="Consolas"/>
+              </w:rPr>
+              <w:t xml:space="preserve">ix</w:t>
+            </w:r>
+            <w:r>
+              <w:t xml:space="preserve"> is its place in the table, from </w:t>
+            </w:r>
+            <w:r>
+              <w:rPr>
+                <w:rFonts w:ascii="Consolas" w:hAnsi="Consolas"/>
+              </w:rPr>
+              <w:t xml:space="preserve">00</w:t>
+            </w:r>
+          </w:p>
+        </w:tc>
+        <w:tc>
+          <w:tcPr>
+            <w:tcW w:w="3460" w:type="dxa"/>
+          </w:tcPr>
+          <w:p>
+            <w:pPr>
+              <w:spacing w:before="0" w:after="0"/>
+            </w:pPr>
+            <w:r>
+              <w:t xml:space="preserve">None, unless something is wrong</w:t>
+            </w:r>
+          </w:p>
+        </w:tc>
+      </w:tr>
+      <w:tr>
+        <w:trPr>
+          <w:cantSplit/>
+        </w:trPr>
+        <w:tc>
+          <w:tcPr>
+            <w:tcW w:w="2000" w:type="dxa"/>
+          </w:tcPr>
+          <w:p>
+            <w:pPr>
+              <w:spacing w:before="0" w:after="0"/>
+            </w:pPr>
+            <w:r>
+              <w:t xml:space="preserve">Part entry</w:t>
+            </w:r>
+          </w:p>
+        </w:tc>
+        <w:tc>
+          <w:tcPr>
+            <w:tcW w:w="3900" w:type="dxa"/>
+          </w:tcPr>
+          <w:p>
+            <w:pPr>
+              <w:spacing w:before="0" w:after="0"/>
+            </w:pPr>
+            <w:r>
+              <w:rPr>
+                <w:rFonts w:ascii="Consolas" w:hAnsi="Consolas"/>
+              </w:rPr>
+              <w:t xml:space="preserve">F0 7D 4C 57 52 qq n0 n1 so pa (ix pp pairs) F7</w:t>
+            </w:r>
+            <w:r>
+              <w:t xml:space="preserve">. </w:t>
+            </w:r>
+            <w:r>
+              <w:rPr>
+                <w:rFonts w:ascii="Consolas" w:hAnsi="Consolas"/>
+              </w:rPr>
+              <w:t xml:space="preserve">n0 n1</w:t>
+            </w:r>
+            <w:r>
+              <w:t xml:space="preserve">: the part’s place in playing order, from 0. </w:t>
+            </w:r>
+            <w:r>
+              <w:rPr>
+                <w:rFonts w:ascii="Consolas" w:hAnsi="Consolas"/>
+              </w:rPr>
+              <w:t xml:space="preserve">so</w:t>
+            </w:r>
+            <w:r>
+              <w:t xml:space="preserve">: song (</w:t>
+            </w:r>
+            <w:r>
+              <w:rPr>
+                <w:rFonts w:ascii="Consolas" w:hAnsi="Consolas"/>
+              </w:rPr>
+              <w:t xml:space="preserve">01</w:t>
+            </w:r>
+            <w:r>
+              <w:t xml:space="preserve">–</w:t>
+            </w:r>
+            <w:r>
+              <w:rPr>
+                <w:rFonts w:ascii="Consolas" w:hAnsi="Consolas"/>
+              </w:rPr>
+              <w:t xml:space="preserve">63</w:t>
+            </w:r>
+            <w:r>
+              <w:t xml:space="preserve">, which is 1–99). </w:t>
+            </w:r>
+            <w:r>
+              <w:rPr>
+                <w:rFonts w:ascii="Consolas" w:hAnsi="Consolas"/>
+              </w:rPr>
+              <w:t xml:space="preserve">pa</w:t>
+            </w:r>
+            <w:r>
+              <w:t xml:space="preserve">: part within the song. Then one pedal </w:t>
+            </w:r>
+            <w:r>
+              <w:rPr>
+                <w:rFonts w:ascii="Consolas" w:hAnsi="Consolas"/>
+              </w:rPr>
+              <w:t xml:space="preserve">ix</w:t>
+            </w:r>
+            <w:r>
+              <w:t xml:space="preserve"> and preset slot </w:t>
+            </w:r>
+            <w:r>
+              <w:rPr>
+                <w:rFonts w:ascii="Consolas" w:hAnsi="Consolas"/>
+              </w:rPr>
+              <w:t xml:space="preserve">pp</w:t>
+            </w:r>
+            <w:r>
+              <w:t xml:space="preserve"> per pedal that changes</w:t>
+            </w:r>
+          </w:p>
+        </w:tc>
+        <w:tc>
+          <w:tcPr>
+            <w:tcW w:w="3460" w:type="dxa"/>
+          </w:tcPr>
+          <w:p>
+            <w:pPr>
+              <w:spacing w:before="0" w:after="0"/>
+            </w:pPr>
+            <w:r>
+              <w:t xml:space="preserve">None, unless something is wrong</w:t>
+            </w:r>
+          </w:p>
+        </w:tc>
+      </w:tr>
+      <w:tr>
+        <w:trPr>
+          <w:cantSplit/>
+        </w:trPr>
+        <w:tc>
+          <w:tcPr>
+            <w:tcW w:w="2000" w:type="dxa"/>
+          </w:tcPr>
+          <w:p>
+            <w:pPr>
+              <w:spacing w:before="0" w:after="0"/>
+            </w:pPr>
+            <w:r>
+              <w:t xml:space="preserve">Setlist finish</w:t>
+            </w:r>
+          </w:p>
+        </w:tc>
+        <w:tc>
+          <w:tcPr>
+            <w:tcW w:w="3900" w:type="dxa"/>
+          </w:tcPr>
+          <w:p>
+            <w:pPr>
+              <w:spacing w:before="0" w:after="0"/>
+            </w:pPr>
+            <w:r>
+              <w:rPr>
+                <w:rFonts w:ascii="Consolas" w:hAnsi="Consolas"/>
+              </w:rPr>
+              <w:t xml:space="preserve">F0 7D 4C 57 53 qq c0…c4 F7</w:t>
+            </w:r>
+            <w:r>
+              <w:t xml:space="preserve">. CRC-32 of the bytes after </w:t>
+            </w:r>
+            <w:r>
+              <w:rPr>
+                <w:rFonts w:ascii="Consolas" w:hAnsi="Consolas"/>
+              </w:rPr>
+              <w:t xml:space="preserve">qq</w:t>
+            </w:r>
+            <w:r>
+              <w:t xml:space="preserve"> in every pedal and part entry, in the order sent</w:t>
+            </w:r>
+          </w:p>
+        </w:tc>
+        <w:tc>
+          <w:tcPr>
+            <w:tcW w:w="3460" w:type="dxa"/>
+          </w:tcPr>
+          <w:p>
+            <w:pPr>
+              <w:spacing w:before="0" w:after="0"/>
+            </w:pPr>
+            <w:r>
+              <w:t xml:space="preserve">Checks the counts and CRC and switches to the new setlist. Acknowledgement: </w:t>
+            </w:r>
+            <w:r>
+              <w:rPr>
+                <w:rFonts w:ascii="Consolas" w:hAnsi="Consolas"/>
+              </w:rPr>
+              <w:t xml:space="preserve">00</w:t>
+            </w:r>
+            <w:r>
+              <w:t xml:space="preserve">, or </w:t>
+            </w:r>
+            <w:r>
+              <w:rPr>
+                <w:rFonts w:ascii="Consolas" w:hAnsi="Consolas"/>
+              </w:rPr>
+              <w:t xml:space="preserve">07</w:t>
+            </w:r>
+            <w:r>
+              <w:t xml:space="preserve"> if the check failed</w:t>
+            </w:r>
+          </w:p>
+        </w:tc>
+      </w:tr>
+      <w:tr>
+        <w:trPr>
+          <w:cantSplit/>
+        </w:trPr>
+        <w:tc>
+          <w:tcPr>
+            <w:tcW w:w="2000" w:type="dxa"/>
+          </w:tcPr>
+          <w:p>
+            <w:pPr>
+              <w:spacing w:before="0" w:after="0"/>
+            </w:pPr>
+            <w:r>
+              <w:t xml:space="preserve">Setlist info</w:t>
+            </w:r>
+          </w:p>
+        </w:tc>
+        <w:tc>
+          <w:tcPr>
+            <w:tcW w:w="3900" w:type="dxa"/>
+          </w:tcPr>
+          <w:p>
+            <w:pPr>
+              <w:spacing w:before="0" w:after="0"/>
+            </w:pPr>
+            <w:r>
+              <w:rPr>
+                <w:rFonts w:ascii="Consolas" w:hAnsi="Consolas"/>
+              </w:rPr>
+              <w:t xml:space="preserve">F0 7D 4C 57 54 qq F7</w:t>
+            </w:r>
+          </w:p>
+        </w:tc>
+        <w:tc>
+          <w:tcPr>
+            <w:tcW w:w="3460" w:type="dxa"/>
+          </w:tcPr>
+          <w:p>
+            <w:pPr>
+              <w:spacing w:before="0" w:after="0"/>
+            </w:pPr>
+            <w:r>
+              <w:rPr>
+                <w:rFonts w:ascii="Consolas" w:hAnsi="Consolas"/>
+              </w:rPr>
+              <w:t xml:space="preserve">F0 7D 4C 57 55 qq i0…i4 c0…c4 ff np n0 n1 F7</w:t>
+            </w:r>
+            <w:r>
+              <w:t xml:space="preserve">, or acknowledgement </w:t>
+            </w:r>
+            <w:r>
+              <w:rPr>
+                <w:rFonts w:ascii="Consolas" w:hAnsi="Consolas"/>
+              </w:rPr>
+              <w:t xml:space="preserve">06</w:t>
+            </w:r>
+            <w:r>
+              <w:t xml:space="preserve"> if there is no setlist</w:t>
+            </w:r>
+          </w:p>
+        </w:tc>
+      </w:tr>
+    </w:tbl>
+    <w:p>
+      <w:pPr/>
+    </w:p>
+    <w:p>
+      <w:pPr>
+        <w:pStyle w:val="Heading3"/>
+      </w:pPr>
+      <w:r>
+        <w:t xml:space="preserve">Live position</w:t>
+      </w:r>
+    </w:p>
+    <w:tbl>
+      <w:tblPr>
+        <w:tblW w:w="9360" w:type="dxa"/>
+        <w:tblBorders>
+          <w:top w:val="single" w:sz="4" w:space="0" w:color="A0A0A0"/>
+          <w:left w:val="single" w:sz="4" w:space="0" w:color="A0A0A0"/>
+          <w:bottom w:val="single" w:sz="4" w:space="0" w:color="A0A0A0"/>
+          <w:right w:val="single" w:sz="4" w:space="0" w:color="A0A0A0"/>
+          <w:insideH w:val="single" w:sz="4" w:space="0" w:color="A0A0A0"/>
+          <w:insideV w:val="single" w:sz="4" w:space="0" w:color="A0A0A0"/>
+        </w:tblBorders>
+        <w:tblLayout w:type="fixed"/>
+        <w:tblCellMar>
+          <w:top w:w="40" w:type="dxa"/>
+          <w:left w:w="100" w:type="dxa"/>
+          <w:bottom w:w="40" w:type="dxa"/>
+          <w:right w:w="100" w:type="dxa"/>
+        </w:tblCellMar>
+      </w:tblPr>
+      <w:tblGrid>
+        <w:gridCol w:w="2000"/>
+        <w:gridCol w:w="3900"/>
+        <w:gridCol w:w="3460"/>
+      </w:tblGrid>
+      <w:tr>
+        <w:trPr>
+          <w:cantSplit/>
+          <w:tblHeader/>
+        </w:trPr>
+        <w:tc>
+          <w:tcPr>
+            <w:tcW w:w="2000" w:type="dxa"/>
+            <w:shd w:val="clear" w:color="auto" w:fill="E7E6E6"/>
+          </w:tcPr>
+          <w:p>
+            <w:pPr>
+              <w:spacing w:before="0" w:after="0"/>
+            </w:pPr>
+            <w:r>
+              <w:rPr>
+                <w:b/>
+              </w:rPr>
+              <w:t xml:space="preserve">Message</w:t>
+            </w:r>
+          </w:p>
+        </w:tc>
+        <w:tc>
+          <w:tcPr>
+            <w:tcW w:w="3900" w:type="dxa"/>
+            <w:shd w:val="clear" w:color="auto" w:fill="E7E6E6"/>
+          </w:tcPr>
+          <w:p>
+            <w:pPr>
+              <w:spacing w:before="0" w:after="0"/>
+            </w:pPr>
+            <w:r>
+              <w:rPr>
+                <w:b/>
+              </w:rPr>
+              <w:t xml:space="preserve">Bytes</w:t>
+            </w:r>
+          </w:p>
+        </w:tc>
+        <w:tc>
+          <w:tcPr>
+            <w:tcW w:w="3460" w:type="dxa"/>
+            <w:shd w:val="clear" w:color="auto" w:fill="E7E6E6"/>
+          </w:tcPr>
+          <w:p>
+            <w:pPr>
+              <w:spacing w:before="0" w:after="0"/>
+            </w:pPr>
+            <w:r>
+              <w:rPr>
+                <w:b/>
+              </w:rPr>
+              <w:t xml:space="preserve">What happens</w:t>
+            </w:r>
+          </w:p>
+        </w:tc>
+      </w:tr>
+      <w:tr>
+        <w:trPr>
+          <w:cantSplit/>
+        </w:trPr>
+        <w:tc>
+          <w:tcPr>
+            <w:tcW w:w="2000" w:type="dxa"/>
+          </w:tcPr>
+          <w:p>
+            <w:pPr>
+              <w:spacing w:before="0" w:after="0"/>
+            </w:pPr>
+            <w:r>
+              <w:t xml:space="preserve">Get position</w:t>
+            </w:r>
+          </w:p>
+        </w:tc>
+        <w:tc>
+          <w:tcPr>
+            <w:tcW w:w="3900" w:type="dxa"/>
+          </w:tcPr>
+          <w:p>
+            <w:pPr>
+              <w:spacing w:before="0" w:after="0"/>
+            </w:pPr>
+            <w:r>
+              <w:t xml:space="preserve">App: </w:t>
+            </w:r>
+            <w:r>
+              <w:rPr>
+                <w:rFonts w:ascii="Consolas" w:hAnsi="Consolas"/>
+              </w:rPr>
+              <w:t xml:space="preserve">F0 7D 4C 57 58 qq F7</w:t>
+            </w:r>
+          </w:p>
+        </w:tc>
+        <w:tc>
+          <w:tcPr>
+            <w:tcW w:w="3460" w:type="dxa"/>
+          </w:tcPr>
+          <w:p>
+            <w:pPr>
+              <w:spacing w:before="0" w:after="0"/>
+            </w:pPr>
+            <w:r>
+              <w:t xml:space="preserve">Switchyard answers with a Position report</w:t>
+            </w:r>
+          </w:p>
+        </w:tc>
+      </w:tr>
+      <w:tr>
+        <w:trPr>
+          <w:cantSplit/>
+        </w:trPr>
+        <w:tc>
+          <w:tcPr>
+            <w:tcW w:w="2000" w:type="dxa"/>
+          </w:tcPr>
+          <w:p>
+            <w:pPr>
+              <w:spacing w:before="0" w:after="0"/>
+            </w:pPr>
+            <w:r>
+              <w:t xml:space="preserve">Position report</w:t>
+            </w:r>
+          </w:p>
+        </w:tc>
+        <w:tc>
+          <w:tcPr>
+            <w:tcW w:w="3900" w:type="dxa"/>
+          </w:tcPr>
+          <w:p>
+            <w:pPr>
+              <w:spacing w:before="0" w:after="0"/>
+            </w:pPr>
+            <w:r>
+              <w:t xml:space="preserve">Switchyard: </w:t>
+            </w:r>
+            <w:r>
+              <w:rPr>
+                <w:rFonts w:ascii="Consolas" w:hAnsi="Consolas"/>
+              </w:rPr>
+              <w:t xml:space="preserve">F0 7D 4C 57 59 qq n0 n1 so pa why F7</w:t>
+            </w:r>
+          </w:p>
+        </w:tc>
+        <w:tc>
+          <w:tcPr>
+            <w:tcW w:w="3460" w:type="dxa"/>
+          </w:tcPr>
+          <w:p>
+            <w:pPr>
+              <w:spacing w:before="0" w:after="0"/>
+            </w:pPr>
+            <w:r>
+              <w:t xml:space="preserve">The current part, its song and part within the song, and why it was sent: </w:t>
+            </w:r>
+            <w:r>
+              <w:rPr>
+                <w:rFonts w:ascii="Consolas" w:hAnsi="Consolas"/>
+              </w:rPr>
+              <w:t xml:space="preserve">00</w:t>
+            </w:r>
+            <w:r>
+              <w:t xml:space="preserve"> Up, </w:t>
+            </w:r>
+            <w:r>
+              <w:rPr>
+                <w:rFonts w:ascii="Consolas" w:hAnsi="Consolas"/>
+              </w:rPr>
+              <w:t xml:space="preserve">01</w:t>
+            </w:r>
+            <w:r>
+              <w:t xml:space="preserve"> Down, </w:t>
+            </w:r>
+            <w:r>
+              <w:rPr>
+                <w:rFonts w:ascii="Consolas" w:hAnsi="Consolas"/>
+              </w:rPr>
+              <w:t xml:space="preserve">02</w:t>
+            </w:r>
+            <w:r>
+              <w:t xml:space="preserve"> Up at the end with no wrap, </w:t>
+            </w:r>
+            <w:r>
+              <w:rPr>
+                <w:rFonts w:ascii="Consolas" w:hAnsi="Consolas"/>
+              </w:rPr>
+              <w:t xml:space="preserve">03</w:t>
+            </w:r>
+            <w:r>
+              <w:t xml:space="preserve"> Down at the start with no wrap, </w:t>
+            </w:r>
+            <w:r>
+              <w:rPr>
+                <w:rFonts w:ascii="Consolas" w:hAnsi="Consolas"/>
+              </w:rPr>
+              <w:t xml:space="preserve">04</w:t>
+            </w:r>
+            <w:r>
+              <w:t xml:space="preserve"> Jump, </w:t>
+            </w:r>
+            <w:r>
+              <w:rPr>
+                <w:rFonts w:ascii="Consolas" w:hAnsi="Consolas"/>
+              </w:rPr>
+              <w:t xml:space="preserve">05</w:t>
+            </w:r>
+            <w:r>
+              <w:t xml:space="preserve"> power-up, </w:t>
+            </w:r>
+            <w:r>
+              <w:rPr>
+                <w:rFonts w:ascii="Consolas" w:hAnsi="Consolas"/>
+              </w:rPr>
+              <w:t xml:space="preserve">06</w:t>
+            </w:r>
+            <w:r>
+              <w:t xml:space="preserve"> Get position</w:t>
+            </w:r>
+          </w:p>
+        </w:tc>
+      </w:tr>
+      <w:tr>
+        <w:trPr>
+          <w:cantSplit/>
+        </w:trPr>
+        <w:tc>
+          <w:tcPr>
+            <w:tcW w:w="2000" w:type="dxa"/>
+          </w:tcPr>
+          <w:p>
+            <w:pPr>
+              <w:spacing w:before="0" w:after="0"/>
+            </w:pPr>
+            <w:r>
+              <w:t xml:space="preserve">Jump</w:t>
+            </w:r>
+          </w:p>
+        </w:tc>
+        <w:tc>
+          <w:tcPr>
+            <w:tcW w:w="3900" w:type="dxa"/>
+          </w:tcPr>
+          <w:p>
+            <w:pPr>
+              <w:spacing w:before="0" w:after="0"/>
+            </w:pPr>
+            <w:r>
+              <w:t xml:space="preserve">App: </w:t>
+            </w:r>
+            <w:r>
+              <w:rPr>
+                <w:rFonts w:ascii="Consolas" w:hAnsi="Consolas"/>
+              </w:rPr>
+              <w:t xml:space="preserve">F0 7D 4C 57 5A qq n0 n1 F7</w:t>
+            </w:r>
+          </w:p>
+        </w:tc>
+        <w:tc>
+          <w:tcPr>
+            <w:tcW w:w="3460" w:type="dxa"/>
+          </w:tcPr>
+          <w:p>
+            <w:pPr>
+              <w:spacing w:before="0" w:after="0"/>
+            </w:pPr>
+            <w:r>
+              <w:t xml:space="preserve">Moves to part </w:t>
+            </w:r>
+            <w:r>
+              <w:rPr>
+                <w:rFonts w:ascii="Consolas" w:hAnsi="Consolas"/>
+              </w:rPr>
+              <w:t xml:space="preserve">n0 n1</w:t>
+            </w:r>
+            <w:r>
+              <w:t xml:space="preserve"> and sends its program changes. Acknowledgement (</w:t>
+            </w:r>
+            <w:r>
+              <w:rPr>
+                <w:rFonts w:ascii="Consolas" w:hAnsi="Consolas"/>
+              </w:rPr>
+              <w:t xml:space="preserve">02</w:t>
+            </w:r>
+            <w:r>
+              <w:t xml:space="preserve"> if there is no such part), then a Position report</w:t>
+            </w:r>
+          </w:p>
+        </w:tc>
+      </w:tr>
+    </w:tbl>
+    <w:p>
+      <w:pPr/>
+    </w:p>
+    <w:p>
+      <w:pPr>
+        <w:pStyle w:val="Heading1"/>
+      </w:pPr>
+      <w:r>
+        <w:t xml:space="preserve">Firmware updates</w:t>
+      </w:r>
+    </w:p>
+    <w:p>
+      <w:pPr>
+        <w:pStyle w:val="ListParagraph"/>
+        <w:numPr>
+          <w:ilvl w:val="0"/>
+          <w:numId w:val="90"/>
+        </w:numPr>
+      </w:pPr>
+      <w:r>
+        <w:rPr>
+          <w:b/>
+        </w:rPr>
+        <w:t xml:space="preserve">Route:</w:t>
+      </w:r>
+      <w:r>
+        <w:t xml:space="preserve"> the app downloads firmware from the Greywire server, sends it to Switchyard over USB, and Switchyard sends it around the MIDI loop addressed to one pedal by serial number. The pedal confirms each part and reports when it’s finished.</w:t>
+      </w:r>
+    </w:p>
+    <w:p>
+      <w:pPr>
+        <w:pStyle w:val="ListParagraph"/>
+        <w:numPr>
+          <w:ilvl w:val="0"/>
+          <w:numId w:val="90"/>
+        </w:numPr>
+      </w:pPr>
+      <w:r>
+        <w:rPr>
+          <w:b/>
+        </w:rPr>
+        <w:t xml:space="preserve">Protected:</w:t>
+      </w:r>
+      <w:r>
+        <w:t xml:space="preserve"> each pedal keeps two copies of its firmware. Updates go into the spare copy and are checked before the pedal switches over. A failed or interrupted update leaves the old version running.</w:t>
+      </w:r>
+    </w:p>
+    <w:p>
+      <w:pPr>
+        <w:pStyle w:val="ListParagraph"/>
+        <w:numPr>
+          <w:ilvl w:val="0"/>
+          <w:numId w:val="90"/>
+        </w:numPr>
+      </w:pPr>
+      <w:r>
+        <w:rPr>
+          <w:b/>
+        </w:rPr>
+        <w:t xml:space="preserve">Recovery mode:</w:t>
+      </w:r>
+      <w:r>
+        <w:t xml:space="preserve"> each pedal has a button combination at power-up that starts a minimal recovery program waiting for a new update. Each product document lists its combination.</w:t>
+      </w:r>
+    </w:p>
+    <w:p>
+      <w:pPr>
+        <w:pStyle w:val="ListParagraph"/>
+        <w:numPr>
+          <w:ilvl w:val="0"/>
+          <w:numId w:val="90"/>
+        </w:numPr>
+      </w:pPr>
+      <w:r>
+        <w:rPr>
+          <w:b/>
+        </w:rPr>
+        <w:t xml:space="preserve">During an update</w:t>
+      </w:r>
+      <w:r>
+        <w:t xml:space="preserve"> the pedal stays in bypass, so the guitar signal still passes.</w:t>
+      </w:r>
+    </w:p>
+    <w:p>
+      <w:pPr>
+        <w:pStyle w:val="ListParagraph"/>
+        <w:numPr>
+          <w:ilvl w:val="0"/>
+          <w:numId w:val="90"/>
+        </w:numPr>
+      </w:pPr>
+      <w:r>
+        <w:rPr>
+          <w:b/>
+        </w:rPr>
+        <w:t xml:space="preserve">Speed:</w:t>
+      </w:r>
+      <w:r>
+        <w:t xml:space="preserve"> MIDI moves about 3 KB per second, so a typical update of 100–200 KB takes one to two minutes per pedal.</w:t>
+      </w:r>
+    </w:p>
+    <w:p>
+      <w:pPr>
+        <w:pStyle w:val="ListParagraph"/>
+        <w:numPr>
+          <w:ilvl w:val="0"/>
+          <w:numId w:val="90"/>
+        </w:numPr>
+      </w:pPr>
+      <w:r>
+        <w:rPr>
+          <w:b/>
+        </w:rPr>
+        <w:t xml:space="preserve">Switchyard itself</w:t>
+      </w:r>
+      <w:r>
+        <w:t xml:space="preserve"> is updated over USB with the same firmware messages. The app addresses Firmware: begin to Switchyard’s own serial number, and the data and finish messages use </w:t>
+      </w:r>
+      <w:r>
+        <w:rPr>
+          <w:rFonts w:ascii="Consolas" w:hAnsi="Consolas"/>
+        </w:rPr>
+        <w:t xml:space="preserve">ch</w:t>
+      </w:r>
+      <w:r>
+        <w:t xml:space="preserve"> = </w:t>
+      </w:r>
+      <w:r>
+        <w:rPr>
+          <w:rFonts w:ascii="Consolas" w:hAnsi="Consolas"/>
+        </w:rPr>
+        <w:t xml:space="preserve">7F</w:t>
+      </w:r>
+      <w:r>
+        <w:t xml:space="preserve">. Over USB a 200 KB update takes a few seconds.</w:t>
+      </w:r>
+    </w:p>
+    <w:p>
+      <w:pPr>
+        <w:pStyle w:val="Heading1"/>
+      </w:pPr>
+      <w:r>
+        <w:t xml:space="preserve">Timing</w:t>
+      </w:r>
+    </w:p>
+    <w:p>
+      <w:pPr>
+        <w:pStyle w:val="ListParagraph"/>
+        <w:numPr>
+          <w:ilvl w:val="0"/>
+          <w:numId w:val="90"/>
+        </w:numPr>
+      </w:pPr>
+      <w:r>
+        <w:t xml:space="preserve">A control change message takes about 1 ms to send.</w:t>
+      </w:r>
+    </w:p>
+    <w:p>
+      <w:pPr>
+        <w:pStyle w:val="ListParagraph"/>
+        <w:numPr>
+          <w:ilvl w:val="0"/>
+          <w:numId w:val="90"/>
+        </w:numPr>
+      </w:pPr>
+      <w:r>
+        <w:t xml:space="preserve">A preset change (one program change per pedal) takes about 1 ms per pedal, so a board of 8 pedals changes in under 10 ms.</w:t>
+      </w:r>
+    </w:p>
+    <w:p>
+      <w:pPr>
+        <w:pStyle w:val="ListParagraph"/>
+        <w:numPr>
+          <w:ilvl w:val="0"/>
+          <w:numId w:val="90"/>
+        </w:numPr>
+      </w:pPr>
+      <w:r>
+        <w:t xml:space="preserve">Sending every setting individually takes about 5 ms per pedal for a pedal like Flashover, so presets are the faster way to switch songs.</w:t>
+      </w:r>
+    </w:p>
+    <w:p>
+      <w:pPr>
+        <w:pStyle w:val="Heading1"/>
+      </w:pPr>
+      <w:r>
+        <w:t xml:space="preserve">Versioning</w:t>
+      </w:r>
+    </w:p>
+    <w:p>
+      <w:pPr>
+        <w:pStyle w:val="ListParagraph"/>
+        <w:numPr>
+          <w:ilvl w:val="0"/>
+          <w:numId w:val="90"/>
+        </w:numPr>
+      </w:pPr>
+      <w:r>
+        <w:t xml:space="preserve">Every pedal reports which version of this specification it follows, in its identity reply.</w:t>
+      </w:r>
+    </w:p>
+    <w:p>
+      <w:pPr>
+        <w:pStyle w:val="ListParagraph"/>
+        <w:numPr>
+          <w:ilvl w:val="0"/>
+          <w:numId w:val="90"/>
+        </w:numPr>
+      </w:pPr>
+      <w:r>
+        <w:t xml:space="preserve">New versions of the specification should only add things, never change the meaning of existing messages, so older pedals keep working.</w:t>
+      </w:r>
+    </w:p>
+    <w:p>
+      <w:pPr>
+        <w:pStyle w:val="ListParagraph"/>
+        <w:numPr>
+          <w:ilvl w:val="0"/>
+          <w:numId w:val="90"/>
+        </w:numPr>
+      </w:pPr>
+      <w:r>
+        <w:t xml:space="preserve">Pedals can be updated to newer versions with a firmware update.</w:t>
+      </w:r>
+    </w:p>
+    <w:p>
+      <w:pPr>
+        <w:pStyle w:val="Heading1"/>
+      </w:pPr>
+      <w:r>
+        <w:t xml:space="preserve">Open questions</w:t>
+      </w:r>
+    </w:p>
+    <w:p>
+      <w:pPr>
+        <w:pStyle w:val="ListParagraph"/>
+        <w:numPr>
+          <w:ilvl w:val="0"/>
+          <w:numId w:val="90"/>
+        </w:numPr>
+      </w:pPr>
+      <w:r>
+        <w:t xml:space="preserve">Do any pedals need more than 8 knobs or 7 mode switches?</w:t>
+      </w:r>
+    </w:p>
+    <w:p>
+      <w:pPr>
+        <w:pStyle w:val="ListParagraph"/>
+        <w:numPr>
+          <w:ilvl w:val="0"/>
+          <w:numId w:val="90"/>
+        </w:numPr>
+      </w:pPr>
+      <w:r>
         <w:t xml:space="preserve">Is the fine-adjustment range (control change 52–59) needed for any pedal, or is 128 steps enough?</w:t>
+      </w:r>
+    </w:p>
+    <w:p>
+      <w:pPr>
+        <w:pStyle w:val="Heading1"/>
+      </w:pPr>
+      <w:r>
+        <w:t xml:space="preserve">Glossary</w:t>
+      </w:r>
+    </w:p>
+    <w:p>
+      <w:pPr>
+        <w:pStyle w:val="Heading3"/>
+      </w:pPr>
+      <w:r>
+        <w:t xml:space="preserve">Active Sensing</w:t>
+      </w:r>
+    </w:p>
+    <w:p>
+      <w:pPr/>
+      <w:r>
+        <w:t xml:space="preserve">A standard one-byte MIDI message, </w:t>
+      </w:r>
+      <w:r>
+        <w:rPr>
+          <w:rFonts w:ascii="Consolas" w:hAnsi="Consolas"/>
+        </w:rPr>
+        <w:t xml:space="preserve">FE</w:t>
+      </w:r>
+      <w:r>
+        <w:t xml:space="preserve">, that a device sends regularly to show its connection is alive. Linework uses it as a heartbeat: Switchyard sends it around the loop every 250 ms, so a gap means something on the loop has stopped passing messages on.</w:t>
+      </w:r>
+    </w:p>
+    <w:p>
+      <w:pPr>
+        <w:pStyle w:val="Heading3"/>
+      </w:pPr>
+      <w:r>
+        <w:t xml:space="preserve">CRC-32</w:t>
+      </w:r>
+    </w:p>
+    <w:p>
+      <w:pPr/>
+      <w:r>
+        <w:t xml:space="preserve">A 32-bit check number calculated from a block of data. The sender calculates it and sends it at the end, and the receiver calculates it again from what arrived. If even one byte was lost or changed, the two numbers won’t match. Linework uses the standard CRC-32, the same one used by ZIP files.</w:t>
+      </w:r>
+    </w:p>
+    <w:p>
+      <w:pPr>
+        <w:pStyle w:val="Heading3"/>
+      </w:pPr>
+      <w:r>
+        <w:t xml:space="preserve">Two-byte numbers</w:t>
+      </w:r>
+    </w:p>
+    <w:p>
+      <w:pPr/>
+      <w:r>
+        <w:t xml:space="preserve">MIDI data bytes only go up to 127, so a bigger number is split across two bytes. </w:t>
+      </w:r>
+      <w:r>
+        <w:rPr>
+          <w:rFonts w:ascii="Consolas" w:hAnsi="Consolas"/>
+        </w:rPr>
+        <w:t xml:space="preserve">n0</w:t>
+      </w:r>
+      <w:r>
+        <w:t xml:space="preserve"> holds the low 7 bits and </w:t>
+      </w:r>
+      <w:r>
+        <w:rPr>
+          <w:rFonts w:ascii="Consolas" w:hAnsi="Consolas"/>
+        </w:rPr>
+        <w:t xml:space="preserve">n1</w:t>
+      </w:r>
+      <w:r>
+        <w:t xml:space="preserve"> the next 7, so the number is </w:t>
+      </w:r>
+      <w:r>
+        <w:rPr>
+          <w:rFonts w:ascii="Consolas" w:hAnsi="Consolas"/>
+        </w:rPr>
+        <w:t xml:space="preserve">n0</w:t>
+      </w:r>
+      <w:r>
+        <w:t xml:space="preserve"> + 128 × </w:t>
+      </w:r>
+      <w:r>
+        <w:rPr>
+          <w:rFonts w:ascii="Consolas" w:hAnsi="Consolas"/>
+        </w:rPr>
+        <w:t xml:space="preserve">n1</w:t>
+      </w:r>
+      <w:r>
+        <w:t xml:space="preserve">, up to 16,383. For example, part 300 is sent as </w:t>
+      </w:r>
+      <w:r>
+        <w:rPr>
+          <w:rFonts w:ascii="Consolas" w:hAnsi="Consolas"/>
+        </w:rPr>
+        <w:t xml:space="preserve">2C 02</w:t>
+      </w:r>
+      <w:r>
+        <w:t xml:space="preserve">: 44 + 128 × 2.</w:t>
+      </w:r>
+    </w:p>
+    <w:p>
+      <w:pPr>
+        <w:pStyle w:val="Heading3"/>
+      </w:pPr>
+      <w:r>
+        <w:t xml:space="preserve">USB MIDI</w:t>
+      </w:r>
+    </w:p>
+    <w:p>
+      <w:pPr/>
+      <w:r>
+        <w:t xml:space="preserve">A standard way to carry MIDI messages over a USB cable. iPhones and Android phones support it built in, so any app can talk to a USB MIDI device without drivers or a licensing program. A USB MIDI device can offer several ports, like separate cables; Switchyard uses one.</w:t>
       </w:r>
     </w:p>
     <w:sectPr>

</xml_diff>